<commit_message>
Recarga de evidencias APT122 - Seccion 006 - Grupo 10
</commit_message>
<xml_diff>
--- a/FASE 1/Evidencias Grupales/1.5_GuiaEstudiante_Fase 1_Definicion Proyecto APT (Espanol).docx
+++ b/FASE 1/Evidencias Grupales/1.5_GuiaEstudiante_Fase 1_Definicion Proyecto APT (Espanol).docx
@@ -1243,7 +1243,7 @@
                 <w:szCs w:val="20"/>
                 <w:rtl w:val="0"/>
               </w:rPr>
-              <w:t xml:space="preserve">Desarrolla Movíl, Modelamiento de Bases de datos</w:t>
+              <w:t xml:space="preserve">Desarrollo Móvil, Modelamiento de Bases de datos</w:t>
             </w:r>
             <w:r>
               <w:rPr>
@@ -1744,7 +1744,7 @@
                 <w:szCs w:val="20"/>
                 <w:rtl w:val="0"/>
               </w:rPr>
-              <w:t xml:space="preserve">Actualmente este proyecto se dirige a todo tipo usuario, en observación a lo flexible y variable en gustos personales con el estilo de vida y con el objetivo de cada usuario, ofreciendo una aplicación que se concentre en dejar de lado el uso excesivo del celular y darle un uso más saludable, haciendo uso de la tecnología de forma didáctica en esta ocasión la propuesta de este proyecto es administrar los tiempos que el usuario quiera dedicarle a cada activador/deber que realiza en el dia cotidiano dando como objetivo lograr metas en forma individual o grupal, compartiendo la racha y cuidando una mascota virtual.</w:t>
+              <w:t xml:space="preserve">Actualmente este proyecto se dirige a todo tipo usuario, en observación a lo flexible y variable en gustos personales con el estilo de vida y con el objetivo de cada usuario, ofreciendo una aplicación que se concentre en dejar de lado el uso excesivo del celular y darle un uso más saludable, utilizando la tecnología de forma didáctica en esta ocasión la propuesta es administrar los tiempos que el usuario quiera dedicarle a cada actividad que realiza en el dia cotidiano tomando como objetivo lograr metas en forma individual o grupal y cuidando una mascota virtual.</w:t>
             </w:r>
           </w:p>
           <w:p>
@@ -1781,31 +1781,6 @@
               </w:rPr>
               <w:t xml:space="preserve">La aplicación busca generar rutinas adaptables al usuario ya sea que quiera comenzar alguna actividad cotidiana , rutinas de ejercicios, recordatorios de clases o aprender un hobbie , etc.</w:t>
             </w:r>
-          </w:p>
-          <w:p>
-            <w:pPr>
-              <w:keepNext w:val="0"/>
-              <w:keepLines w:val="0"/>
-              <w:pageBreakBefore w:val="0"/>
-              <w:widowControl w:val="1"/>
-              <w:pBdr>
-                <w:top w:space="0" w:sz="0" w:val="nil"/>
-                <w:left w:space="0" w:sz="0" w:val="nil"/>
-                <w:bottom w:space="0" w:sz="0" w:val="nil"/>
-                <w:right w:space="0" w:sz="0" w:val="nil"/>
-                <w:between w:space="0" w:sz="0" w:val="nil"/>
-              </w:pBdr>
-              <w:shd w:fill="auto" w:val="clear"/>
-              <w:spacing w:after="160" w:before="0" w:line="259" w:lineRule="auto"/>
-              <w:ind w:left="0" w:right="0" w:firstLine="0"/>
-              <w:jc w:val="both"/>
-              <w:rPr>
-                <w:i w:val="1"/>
-                <w:iCs w:val="1"/>
-                <w:sz w:val="20"/>
-                <w:szCs w:val="20"/>
-              </w:rPr>
-            </w:pPr>
             <w:r>
               <w:rPr>
                 <w:rtl w:val="0"/>
@@ -1865,7 +1840,7 @@
                 <w:szCs w:val="20"/>
                 <w:rtl w:val="0"/>
               </w:rPr>
-              <w:t xml:space="preserve">El objetivo del proyecto es que el usuario utilice menos el celular, reducir las horas de uso del teléfono y que la aplicación logre organizar los tiempos del usuario, dándole misiones y tareas con su rutina diaria cuidando a la mascota que es la aplicacion, asi el usuario administra su día de forma más didáctica con esta aplicación y puede ser con metas grupales, familiar o individual.</w:t>
+              <w:t xml:space="preserve">El objetivo de la aplicación es que el usuario reduzca las horas de uso del teléfono y que logre organizar sus tiempos y actividades, cuidando a su mascota al mismo tiempo, asi administrando su día de forma más didáctica.</w:t>
             </w:r>
             <w:r>
               <w:rPr>
@@ -1924,28 +1899,28 @@
                 <w:szCs w:val="20"/>
                 <w:rtl w:val="0"/>
               </w:rPr>
-              <w:t xml:space="preserve">se relaciona de manera que este proyecto, es un proyecto informático donde se relaciona directamente con lo que es el uso de aplicaciones móviles.  contemplando el análisis, diseño, desarrollo e implementación de una solución de software orientada a resolver una necesidad o más bien buenas prácticas en el uso del celular/tecnología.</w:t>
-            </w:r>
-          </w:p>
-          <w:p>
-            <w:pPr>
-              <w:jc w:val="both"/>
-              <w:rPr>
-                <w:i w:val="1"/>
-                <w:iCs w:val="1"/>
-                <w:sz w:val="20"/>
-                <w:szCs w:val="20"/>
-              </w:rPr>
-            </w:pPr>
-            <w:r>
-              <w:rPr>
-                <w:i w:val="1"/>
-                <w:iCs w:val="1"/>
-                <w:sz w:val="20"/>
-                <w:szCs w:val="20"/>
-                <w:rtl w:val="0"/>
-              </w:rPr>
-              <w:t xml:space="preserve">El proyecto integra tecnologías como flutter, lenguaje de programación dart, java y spring boot, junto con microservicios.</w:t>
+              <w:t xml:space="preserve">Se relaciona directamente con el uso de aplicaciones móviles.  contemplando el análisis, diseño, desarrollo e implementación de una solución de software orientada a resolver una necesidad, implementando buenas prácticas en el uso del celular/tecnología.</w:t>
+            </w:r>
+          </w:p>
+          <w:p>
+            <w:pPr>
+              <w:jc w:val="both"/>
+              <w:rPr>
+                <w:i w:val="1"/>
+                <w:iCs w:val="1"/>
+                <w:sz w:val="20"/>
+                <w:szCs w:val="20"/>
+              </w:rPr>
+            </w:pPr>
+            <w:r>
+              <w:rPr>
+                <w:i w:val="1"/>
+                <w:iCs w:val="1"/>
+                <w:sz w:val="20"/>
+                <w:szCs w:val="20"/>
+                <w:rtl w:val="0"/>
+              </w:rPr>
+              <w:t xml:space="preserve">El proyecto integra tecnologías como flutter y spring boot, lenguaje de programación dart y java, junto con microservicios.</w:t>
             </w:r>
             <w:r>
               <w:rPr>
@@ -2025,7 +2000,7 @@
                 <w:szCs w:val="20"/>
                 <w:rtl w:val="0"/>
               </w:rPr>
-              <w:t xml:space="preserve">La aplicación desarrolla una aplicación móvil que permite la experiencia utilizando las herramientas flutter, dart, java y spring boot y reforzando el uso y conocimiento de github.</w:t>
+              <w:t xml:space="preserve">La aplicación permite utilizar la experiencia ganada en clases, pulirla y desarrollar conocimientos que nos servirán en nuestra futura carrera.</w:t>
             </w:r>
             <w:r>
               <w:rPr>
@@ -2119,41 +2094,6 @@
               <w:ind w:left="0" w:right="0" w:firstLine="0"/>
               <w:jc w:val="left"/>
               <w:rPr>
-                <w:i w:val="1"/>
-                <w:iCs w:val="1"/>
-                <w:sz w:val="20"/>
-                <w:szCs w:val="20"/>
-              </w:rPr>
-            </w:pPr>
-            <w:r>
-              <w:rPr>
-                <w:i w:val="1"/>
-                <w:iCs w:val="1"/>
-                <w:sz w:val="20"/>
-                <w:szCs w:val="20"/>
-                <w:rtl w:val="0"/>
-              </w:rPr>
-              <w:t xml:space="preserve">En la aplicación se priorizan las características principales del sistema, como el registro y gestión de actividades, seguimiento de objetivos, sistema de mascotas virtuales, notificaciones y perfiles de usuario, dejando funcionalidades complementarias para etapas posteriores en caso de existir restricciones de tiempo. </w:t>
-            </w:r>
-          </w:p>
-          <w:p>
-            <w:pPr>
-              <w:keepNext w:val="0"/>
-              <w:keepLines w:val="0"/>
-              <w:pageBreakBefore w:val="0"/>
-              <w:widowControl w:val="1"/>
-              <w:pBdr>
-                <w:top w:space="0" w:sz="0" w:val="nil"/>
-                <w:left w:space="0" w:sz="0" w:val="nil"/>
-                <w:bottom w:space="0" w:sz="0" w:val="nil"/>
-                <w:right w:space="0" w:sz="0" w:val="nil"/>
-                <w:between w:space="0" w:sz="0" w:val="nil"/>
-              </w:pBdr>
-              <w:shd w:fill="auto" w:val="clear"/>
-              <w:spacing w:after="160" w:before="0" w:line="259" w:lineRule="auto"/>
-              <w:ind w:left="0" w:right="0" w:firstLine="0"/>
-              <w:jc w:val="left"/>
-              <w:rPr>
                 <w:rFonts w:ascii="Calibri" w:cs="Calibri" w:eastAsia="Calibri" w:hAnsi="Calibri"/>
                 <w:b w:val="0"/>
                 <w:bCs w:val="0"/>
@@ -2176,7 +2116,7 @@
                 <w:szCs w:val="20"/>
                 <w:rtl w:val="0"/>
               </w:rPr>
-              <w:t xml:space="preserve">En cuanto a la infraestructura se utilizan servicios y herramientas de desarrollo y junto con la plataformas de almacenamiento. </w:t>
+              <w:t xml:space="preserve">Teniendo estás arquitectura y las tareas definidas, consideramos esta aplicación factible en el periodo de 77 días hábiles definido por el equipo de trabajo. </w:t>
             </w:r>
             <w:r>
               <w:rPr>
@@ -2187,6 +2127,25 @@
         </w:tc>
       </w:tr>
     </w:tbl>
+    <w:p>
+      <w:pPr>
+        <w:rPr>
+          <w:b w:val="1"/>
+          <w:bCs w:val="1"/>
+          <w:color w:val="4472c4"/>
+          <w:sz w:val="32"/>
+          <w:szCs w:val="32"/>
+        </w:rPr>
+      </w:pPr>
+      <w:r>
+        <w:br w:type="page"/>
+      </w:r>
+      <w:r>
+        <w:rPr>
+          <w:rtl w:val="0"/>
+        </w:rPr>
+      </w:r>
+    </w:p>
     <w:p>
       <w:pPr>
         <w:rPr>
@@ -2600,7 +2559,7 @@
                 <w:szCs w:val="20"/>
                 <w:rtl w:val="0"/>
               </w:rPr>
-              <w:t xml:space="preserve"> un sistema de registro y seguimiento de actividades temporales y por tareas.</w:t>
+              <w:t xml:space="preserve"> un sistema de registro y seguimiento de actividades.</w:t>
             </w:r>
           </w:p>
           <w:p>
@@ -3088,8 +3047,6 @@
               <w:spacing w:after="240" w:before="240" w:lineRule="auto"/>
               <w:jc w:val="both"/>
               <w:rPr>
-                <w:i w:val="1"/>
-                <w:iCs w:val="1"/>
                 <w:sz w:val="18"/>
                 <w:szCs w:val="18"/>
               </w:rPr>
@@ -3130,7 +3087,15 @@
                 <w:szCs w:val="18"/>
                 <w:rtl w:val="0"/>
               </w:rPr>
-              <w:t xml:space="preserve"> cumpla con los objetivos planteados.</w:t>
+              <w:t xml:space="preserve"> </w:t>
+            </w:r>
+            <w:r>
+              <w:rPr>
+                <w:sz w:val="18"/>
+                <w:szCs w:val="18"/>
+                <w:rtl w:val="0"/>
+              </w:rPr>
+              <w:t xml:space="preserve">cumpla con los objetivos planteados.</w:t>
             </w:r>
           </w:p>
           <w:p>
@@ -3138,33 +3103,6 @@
               <w:spacing w:after="240" w:before="240" w:lineRule="auto"/>
               <w:jc w:val="both"/>
               <w:rPr>
-                <w:sz w:val="18"/>
-                <w:szCs w:val="18"/>
-              </w:rPr>
-            </w:pPr>
-            <w:r>
-              <w:rPr>
-                <w:i w:val="1"/>
-                <w:iCs w:val="1"/>
-                <w:sz w:val="18"/>
-                <w:szCs w:val="18"/>
-                <w:rtl w:val="0"/>
-              </w:rPr>
-              <w:t xml:space="preserve">Para organizar y coordinar el trabajo del equipo se utilizarán herramientas como</w:t>
-            </w:r>
-            <w:r>
-              <w:rPr>
-                <w:sz w:val="18"/>
-                <w:szCs w:val="18"/>
-                <w:rtl w:val="0"/>
-              </w:rPr>
-              <w:t xml:space="preserve"> WhatsApp y colab de plataforma duoc</w:t>
-            </w:r>
-          </w:p>
-          <w:p>
-            <w:pPr>
-              <w:jc w:val="both"/>
-              <w:rPr>
                 <w:i w:val="1"/>
                 <w:iCs w:val="1"/>
                 <w:color w:val="548dd4"/>
@@ -3172,6 +3110,14 @@
                 <w:szCs w:val="20"/>
               </w:rPr>
             </w:pPr>
+            <w:r>
+              <w:rPr>
+                <w:sz w:val="18"/>
+                <w:szCs w:val="18"/>
+                <w:rtl w:val="0"/>
+              </w:rPr>
+              <w:t xml:space="preserve">Para organizar y coordinar el trabajo del equipo se utilizarán herramientas como WhatsApp y Google meet.</w:t>
+            </w:r>
             <w:r>
               <w:rPr>
                 <w:rtl w:val="0"/>
@@ -3181,23 +3127,6 @@
         </w:tc>
       </w:tr>
     </w:tbl>
-    <w:p>
-      <w:pPr>
-        <w:spacing w:after="0" w:line="360" w:lineRule="auto"/>
-        <w:jc w:val="both"/>
-        <w:rPr>
-          <w:b w:val="1"/>
-          <w:bCs w:val="1"/>
-          <w:sz w:val="24"/>
-          <w:szCs w:val="24"/>
-        </w:rPr>
-      </w:pPr>
-      <w:r>
-        <w:rPr>
-          <w:rtl w:val="0"/>
-        </w:rPr>
-      </w:r>
-    </w:p>
     <w:p>
       <w:pPr>
         <w:spacing w:after="0" w:line="240" w:lineRule="auto"/>
@@ -3208,9 +3137,6 @@
           <w:szCs w:val="24"/>
         </w:rPr>
       </w:pPr>
-      <w:r>
-        <w:br w:type="page"/>
-      </w:r>
       <w:r>
         <w:rPr>
           <w:rtl w:val="0"/>
@@ -3717,9 +3643,8 @@
                 <w:iCs w:val="0"/>
                 <w:smallCaps w:val="0"/>
                 <w:strike w:val="0"/>
-                <w:color w:val="1f3864"/>
-                <w:sz w:val="22"/>
-                <w:szCs w:val="22"/>
+                <w:sz w:val="20"/>
+                <w:szCs w:val="20"/>
                 <w:u w:val="none"/>
                 <w:shd w:fill="auto" w:val="clear"/>
                 <w:vertAlign w:val="baseline"/>
@@ -3729,7 +3654,8 @@
               <w:rPr>
                 <w:b w:val="1"/>
                 <w:bCs w:val="1"/>
-                <w:color w:val="1f3864"/>
+                <w:sz w:val="20"/>
+                <w:szCs w:val="20"/>
                 <w:rtl w:val="0"/>
               </w:rPr>
               <w:t xml:space="preserve">Avance</w:t>
@@ -3771,9 +3697,8 @@
                 <w:iCs w:val="0"/>
                 <w:smallCaps w:val="0"/>
                 <w:strike w:val="0"/>
-                <w:color w:val="1f3864"/>
-                <w:sz w:val="22"/>
-                <w:szCs w:val="22"/>
+                <w:sz w:val="20"/>
+                <w:szCs w:val="20"/>
                 <w:u w:val="none"/>
                 <w:shd w:fill="auto" w:val="clear"/>
                 <w:vertAlign w:val="baseline"/>
@@ -3783,7 +3708,8 @@
               <w:rPr>
                 <w:b w:val="1"/>
                 <w:bCs w:val="1"/>
-                <w:color w:val="1f3864"/>
+                <w:sz w:val="20"/>
+                <w:szCs w:val="20"/>
                 <w:rtl w:val="0"/>
               </w:rPr>
               <w:t xml:space="preserve">Presentación inicial</w:t>
@@ -3802,12 +3728,14 @@
               <w:jc w:val="both"/>
               <w:rPr>
                 <w:rFonts w:ascii="Calibri" w:cs="Calibri" w:eastAsia="Calibri" w:hAnsi="Calibri"/>
-                <w:color w:val="073763"/>
-              </w:rPr>
-            </w:pPr>
-            <w:r>
-              <w:rPr>
-                <w:color w:val="073763"/>
+                <w:sz w:val="20"/>
+                <w:szCs w:val="20"/>
+              </w:rPr>
+            </w:pPr>
+            <w:r>
+              <w:rPr>
+                <w:sz w:val="20"/>
+                <w:szCs w:val="20"/>
                 <w:rtl w:val="0"/>
               </w:rPr>
               <w:t xml:space="preserve">Presentación utilizando diapositivas que facilita la comprensión básica del proyecto.</w:t>
@@ -3847,9 +3775,8 @@
                 <w:iCs w:val="0"/>
                 <w:smallCaps w:val="0"/>
                 <w:strike w:val="0"/>
-                <w:color w:val="1f3864"/>
-                <w:sz w:val="22"/>
-                <w:szCs w:val="22"/>
+                <w:sz w:val="20"/>
+                <w:szCs w:val="20"/>
                 <w:u w:val="none"/>
                 <w:shd w:fill="auto" w:val="clear"/>
                 <w:vertAlign w:val="baseline"/>
@@ -3857,7 +3784,8 @@
             </w:pPr>
             <w:r>
               <w:rPr>
-                <w:color w:val="1f3864"/>
+                <w:sz w:val="20"/>
+                <w:szCs w:val="20"/>
                 <w:rtl w:val="0"/>
               </w:rPr>
               <w:t xml:space="preserve">Dar a entender los conceptos más básicos del proyecto</w:t>
@@ -3907,9 +3835,8 @@
                 <w:iCs w:val="0"/>
                 <w:smallCaps w:val="0"/>
                 <w:strike w:val="0"/>
-                <w:color w:val="1f3864"/>
-                <w:sz w:val="22"/>
-                <w:szCs w:val="22"/>
+                <w:sz w:val="20"/>
+                <w:szCs w:val="20"/>
                 <w:u w:val="none"/>
                 <w:shd w:fill="auto" w:val="clear"/>
                 <w:vertAlign w:val="baseline"/>
@@ -3919,7 +3846,8 @@
               <w:rPr>
                 <w:b w:val="1"/>
                 <w:bCs w:val="1"/>
-                <w:color w:val="1f3864"/>
+                <w:sz w:val="20"/>
+                <w:szCs w:val="20"/>
                 <w:rtl w:val="0"/>
               </w:rPr>
               <w:t xml:space="preserve">Avance</w:t>
@@ -3961,9 +3889,8 @@
                 <w:iCs w:val="0"/>
                 <w:smallCaps w:val="0"/>
                 <w:strike w:val="0"/>
-                <w:color w:val="1f3864"/>
-                <w:sz w:val="22"/>
-                <w:szCs w:val="22"/>
+                <w:sz w:val="20"/>
+                <w:szCs w:val="20"/>
                 <w:u w:val="none"/>
                 <w:shd w:fill="auto" w:val="clear"/>
                 <w:vertAlign w:val="baseline"/>
@@ -3973,7 +3900,8 @@
               <w:rPr>
                 <w:b w:val="1"/>
                 <w:bCs w:val="1"/>
-                <w:color w:val="1f3864"/>
+                <w:sz w:val="20"/>
+                <w:szCs w:val="20"/>
                 <w:rtl w:val="0"/>
               </w:rPr>
               <w:t xml:space="preserve">Acta de constitución</w:t>
@@ -3998,9 +3926,8 @@
                 <w:iCs w:val="0"/>
                 <w:smallCaps w:val="0"/>
                 <w:strike w:val="0"/>
-                <w:color w:val="1f3864"/>
-                <w:sz w:val="22"/>
-                <w:szCs w:val="22"/>
+                <w:sz w:val="20"/>
+                <w:szCs w:val="20"/>
                 <w:u w:val="none"/>
                 <w:shd w:fill="auto" w:val="clear"/>
                 <w:vertAlign w:val="baseline"/>
@@ -4008,7 +3935,8 @@
             </w:pPr>
             <w:r>
               <w:rPr>
-                <w:color w:val="073763"/>
+                <w:sz w:val="20"/>
+                <w:szCs w:val="20"/>
                 <w:rtl w:val="0"/>
               </w:rPr>
               <w:t xml:space="preserve">Documento inicial de la fase de proyectos que define el límite que tendrá el proyecto.</w:t>
@@ -4037,9 +3965,8 @@
                 <w:iCs w:val="0"/>
                 <w:smallCaps w:val="0"/>
                 <w:strike w:val="0"/>
-                <w:color w:val="1f3864"/>
-                <w:sz w:val="22"/>
-                <w:szCs w:val="22"/>
+                <w:sz w:val="20"/>
+                <w:szCs w:val="20"/>
                 <w:u w:val="none"/>
                 <w:shd w:fill="auto" w:val="clear"/>
                 <w:vertAlign w:val="baseline"/>
@@ -4047,7 +3974,8 @@
             </w:pPr>
             <w:r>
               <w:rPr>
-                <w:color w:val="1f3864"/>
+                <w:sz w:val="20"/>
+                <w:szCs w:val="20"/>
                 <w:rtl w:val="0"/>
               </w:rPr>
               <w:t xml:space="preserve">Conocer los límites que puede tener el proyecto en su desarrollo.</w:t>
@@ -4084,9 +4012,8 @@
                 <w:iCs w:val="0"/>
                 <w:smallCaps w:val="0"/>
                 <w:strike w:val="0"/>
-                <w:color w:val="1f3864"/>
-                <w:sz w:val="22"/>
-                <w:szCs w:val="22"/>
+                <w:sz w:val="20"/>
+                <w:szCs w:val="20"/>
                 <w:u w:val="none"/>
                 <w:shd w:fill="auto" w:val="clear"/>
                 <w:vertAlign w:val="baseline"/>
@@ -4096,7 +4023,8 @@
               <w:rPr>
                 <w:b w:val="1"/>
                 <w:bCs w:val="1"/>
-                <w:color w:val="1f3864"/>
+                <w:sz w:val="20"/>
+                <w:szCs w:val="20"/>
                 <w:rtl w:val="0"/>
               </w:rPr>
               <w:t xml:space="preserve">Avance</w:t>
@@ -4138,9 +4066,8 @@
                 <w:iCs w:val="0"/>
                 <w:smallCaps w:val="0"/>
                 <w:strike w:val="0"/>
-                <w:color w:val="1f3864"/>
-                <w:sz w:val="22"/>
-                <w:szCs w:val="22"/>
+                <w:sz w:val="20"/>
+                <w:szCs w:val="20"/>
                 <w:u w:val="none"/>
                 <w:shd w:fill="auto" w:val="clear"/>
                 <w:vertAlign w:val="baseline"/>
@@ -4150,7 +4077,8 @@
               <w:rPr>
                 <w:b w:val="1"/>
                 <w:bCs w:val="1"/>
-                <w:color w:val="1f3864"/>
+                <w:sz w:val="20"/>
+                <w:szCs w:val="20"/>
                 <w:rtl w:val="0"/>
               </w:rPr>
               <w:t xml:space="preserve">Matriz EDT</w:t>
@@ -4180,9 +4108,8 @@
                 <w:iCs w:val="0"/>
                 <w:smallCaps w:val="0"/>
                 <w:strike w:val="0"/>
-                <w:color w:val="1f3864"/>
-                <w:sz w:val="22"/>
-                <w:szCs w:val="22"/>
+                <w:sz w:val="20"/>
+                <w:szCs w:val="20"/>
                 <w:u w:val="none"/>
                 <w:shd w:fill="auto" w:val="clear"/>
                 <w:vertAlign w:val="baseline"/>
@@ -4190,7 +4117,8 @@
             </w:pPr>
             <w:r>
               <w:rPr>
-                <w:color w:val="1f3864"/>
+                <w:sz w:val="20"/>
+                <w:szCs w:val="20"/>
                 <w:rtl w:val="0"/>
               </w:rPr>
               <w:t xml:space="preserve">Documento que permite gestionar los cambios realizados en el proyecto</w:t>
@@ -4219,9 +4147,8 @@
                 <w:iCs w:val="0"/>
                 <w:smallCaps w:val="0"/>
                 <w:strike w:val="0"/>
-                <w:color w:val="1f3864"/>
-                <w:sz w:val="22"/>
-                <w:szCs w:val="22"/>
+                <w:sz w:val="20"/>
+                <w:szCs w:val="20"/>
                 <w:u w:val="none"/>
                 <w:shd w:fill="auto" w:val="clear"/>
                 <w:vertAlign w:val="baseline"/>
@@ -4229,7 +4156,8 @@
             </w:pPr>
             <w:r>
               <w:rPr>
-                <w:color w:val="1f3864"/>
+                <w:sz w:val="20"/>
+                <w:szCs w:val="20"/>
                 <w:rtl w:val="0"/>
               </w:rPr>
               <w:t xml:space="preserve">Dar a conocer los cambios realizados</w:t>
@@ -4266,9 +4194,8 @@
                 <w:iCs w:val="0"/>
                 <w:smallCaps w:val="0"/>
                 <w:strike w:val="0"/>
-                <w:color w:val="1f3864"/>
-                <w:sz w:val="22"/>
-                <w:szCs w:val="22"/>
+                <w:sz w:val="20"/>
+                <w:szCs w:val="20"/>
                 <w:u w:val="none"/>
                 <w:shd w:fill="auto" w:val="clear"/>
                 <w:vertAlign w:val="baseline"/>
@@ -4278,7 +4205,8 @@
               <w:rPr>
                 <w:b w:val="1"/>
                 <w:bCs w:val="1"/>
-                <w:color w:val="1f3864"/>
+                <w:sz w:val="20"/>
+                <w:szCs w:val="20"/>
                 <w:rtl w:val="0"/>
               </w:rPr>
               <w:t xml:space="preserve">Avance</w:t>
@@ -4320,9 +4248,8 @@
                 <w:iCs w:val="0"/>
                 <w:smallCaps w:val="0"/>
                 <w:strike w:val="0"/>
-                <w:color w:val="1f3864"/>
-                <w:sz w:val="22"/>
-                <w:szCs w:val="22"/>
+                <w:sz w:val="20"/>
+                <w:szCs w:val="20"/>
                 <w:u w:val="none"/>
                 <w:shd w:fill="auto" w:val="clear"/>
                 <w:vertAlign w:val="baseline"/>
@@ -4332,7 +4259,8 @@
               <w:rPr>
                 <w:b w:val="1"/>
                 <w:bCs w:val="1"/>
-                <w:color w:val="1f3864"/>
+                <w:sz w:val="20"/>
+                <w:szCs w:val="20"/>
                 <w:rtl w:val="0"/>
               </w:rPr>
               <w:t xml:space="preserve">Planilla de requerimientos</w:t>
@@ -4362,9 +4290,8 @@
                 <w:iCs w:val="0"/>
                 <w:smallCaps w:val="0"/>
                 <w:strike w:val="0"/>
-                <w:color w:val="1f3864"/>
-                <w:sz w:val="22"/>
-                <w:szCs w:val="22"/>
+                <w:sz w:val="20"/>
+                <w:szCs w:val="20"/>
                 <w:u w:val="none"/>
                 <w:shd w:fill="auto" w:val="clear"/>
                 <w:vertAlign w:val="baseline"/>
@@ -4372,7 +4299,8 @@
             </w:pPr>
             <w:r>
               <w:rPr>
-                <w:color w:val="1f3864"/>
+                <w:sz w:val="20"/>
+                <w:szCs w:val="20"/>
                 <w:rtl w:val="0"/>
               </w:rPr>
               <w:t xml:space="preserve">Documento de los requerimientos funcionales y no funcionales del sistema.</w:t>
@@ -4401,9 +4329,8 @@
                 <w:iCs w:val="0"/>
                 <w:smallCaps w:val="0"/>
                 <w:strike w:val="0"/>
-                <w:color w:val="1f3864"/>
-                <w:sz w:val="22"/>
-                <w:szCs w:val="22"/>
+                <w:sz w:val="20"/>
+                <w:szCs w:val="20"/>
                 <w:u w:val="none"/>
                 <w:shd w:fill="auto" w:val="clear"/>
                 <w:vertAlign w:val="baseline"/>
@@ -4411,7 +4338,8 @@
             </w:pPr>
             <w:r>
               <w:rPr>
-                <w:color w:val="1f3864"/>
+                <w:sz w:val="20"/>
+                <w:szCs w:val="20"/>
                 <w:rtl w:val="0"/>
               </w:rPr>
               <w:t xml:space="preserve">Conocer los requerimientos del sistema para realizar la solución.</w:t>
@@ -4448,9 +4376,8 @@
                 <w:iCs w:val="0"/>
                 <w:smallCaps w:val="0"/>
                 <w:strike w:val="0"/>
-                <w:color w:val="1f3864"/>
-                <w:sz w:val="22"/>
-                <w:szCs w:val="22"/>
+                <w:sz w:val="20"/>
+                <w:szCs w:val="20"/>
                 <w:u w:val="none"/>
                 <w:shd w:fill="auto" w:val="clear"/>
                 <w:vertAlign w:val="baseline"/>
@@ -4460,7 +4387,8 @@
               <w:rPr>
                 <w:b w:val="1"/>
                 <w:bCs w:val="1"/>
-                <w:color w:val="1f3864"/>
+                <w:sz w:val="20"/>
+                <w:szCs w:val="20"/>
                 <w:rtl w:val="0"/>
               </w:rPr>
               <w:t xml:space="preserve">Avance</w:t>
@@ -4502,9 +4430,8 @@
                 <w:iCs w:val="0"/>
                 <w:smallCaps w:val="0"/>
                 <w:strike w:val="0"/>
-                <w:color w:val="1f3864"/>
-                <w:sz w:val="22"/>
-                <w:szCs w:val="22"/>
+                <w:sz w:val="20"/>
+                <w:szCs w:val="20"/>
                 <w:u w:val="none"/>
                 <w:shd w:fill="auto" w:val="clear"/>
                 <w:vertAlign w:val="baseline"/>
@@ -4514,7 +4441,8 @@
               <w:rPr>
                 <w:b w:val="1"/>
                 <w:bCs w:val="1"/>
-                <w:color w:val="1f3864"/>
+                <w:sz w:val="20"/>
+                <w:szCs w:val="20"/>
                 <w:rtl w:val="0"/>
               </w:rPr>
               <w:t xml:space="preserve">Carta gantt</w:t>
@@ -4544,9 +4472,8 @@
                 <w:iCs w:val="0"/>
                 <w:smallCaps w:val="0"/>
                 <w:strike w:val="0"/>
-                <w:color w:val="1f3864"/>
-                <w:sz w:val="22"/>
-                <w:szCs w:val="22"/>
+                <w:sz w:val="20"/>
+                <w:szCs w:val="20"/>
                 <w:u w:val="none"/>
                 <w:shd w:fill="auto" w:val="clear"/>
                 <w:vertAlign w:val="baseline"/>
@@ -4554,7 +4481,8 @@
             </w:pPr>
             <w:r>
               <w:rPr>
-                <w:color w:val="1f3864"/>
+                <w:sz w:val="20"/>
+                <w:szCs w:val="20"/>
                 <w:rtl w:val="0"/>
               </w:rPr>
               <w:t xml:space="preserve">Cronograma del proyecto.</w:t>
@@ -4576,12 +4504,14 @@
               </w:tabs>
               <w:spacing w:after="0" w:line="240" w:lineRule="auto"/>
               <w:rPr>
-                <w:color w:val="1f3864"/>
-              </w:rPr>
-            </w:pPr>
-            <w:r>
-              <w:rPr>
-                <w:color w:val="1f3864"/>
+                <w:sz w:val="20"/>
+                <w:szCs w:val="20"/>
+              </w:rPr>
+            </w:pPr>
+            <w:r>
+              <w:rPr>
+                <w:sz w:val="20"/>
+                <w:szCs w:val="20"/>
                 <w:rtl w:val="0"/>
               </w:rPr>
               <w:t xml:space="preserve">Organizar las fechas para realización de las actividades del proyecto.</w:t>
@@ -4613,9 +4543,8 @@
                 <w:iCs w:val="0"/>
                 <w:smallCaps w:val="0"/>
                 <w:strike w:val="0"/>
-                <w:color w:val="1f3864"/>
-                <w:sz w:val="22"/>
-                <w:szCs w:val="22"/>
+                <w:sz w:val="20"/>
+                <w:szCs w:val="20"/>
                 <w:u w:val="none"/>
                 <w:shd w:fill="auto" w:val="clear"/>
                 <w:vertAlign w:val="baseline"/>
@@ -4625,7 +4554,8 @@
               <w:rPr>
                 <w:b w:val="1"/>
                 <w:bCs w:val="1"/>
-                <w:color w:val="1f3864"/>
+                <w:sz w:val="20"/>
+                <w:szCs w:val="20"/>
                 <w:rtl w:val="0"/>
               </w:rPr>
               <w:t xml:space="preserve">Avance</w:t>
@@ -4667,9 +4597,8 @@
                 <w:iCs w:val="0"/>
                 <w:smallCaps w:val="0"/>
                 <w:strike w:val="0"/>
-                <w:color w:val="1f3864"/>
-                <w:sz w:val="22"/>
-                <w:szCs w:val="22"/>
+                <w:sz w:val="20"/>
+                <w:szCs w:val="20"/>
                 <w:u w:val="none"/>
                 <w:shd w:fill="auto" w:val="clear"/>
                 <w:vertAlign w:val="baseline"/>
@@ -4679,7 +4608,8 @@
               <w:rPr>
                 <w:b w:val="1"/>
                 <w:bCs w:val="1"/>
-                <w:color w:val="1f3864"/>
+                <w:sz w:val="20"/>
+                <w:szCs w:val="20"/>
                 <w:rtl w:val="0"/>
               </w:rPr>
               <w:t xml:space="preserve">Documento de mockups</w:t>
@@ -4709,9 +4639,8 @@
                 <w:iCs w:val="0"/>
                 <w:smallCaps w:val="0"/>
                 <w:strike w:val="0"/>
-                <w:color w:val="1f3864"/>
-                <w:sz w:val="22"/>
-                <w:szCs w:val="22"/>
+                <w:sz w:val="20"/>
+                <w:szCs w:val="20"/>
                 <w:u w:val="none"/>
                 <w:shd w:fill="auto" w:val="clear"/>
                 <w:vertAlign w:val="baseline"/>
@@ -4719,7 +4648,8 @@
             </w:pPr>
             <w:r>
               <w:rPr>
-                <w:color w:val="1f3864"/>
+                <w:sz w:val="20"/>
+                <w:szCs w:val="20"/>
                 <w:rtl w:val="0"/>
               </w:rPr>
               <w:t xml:space="preserve">Descripción gráfica del proyecto, es decir una maqueta con todas las vistas del proyecto.</w:t>
@@ -4748,9 +4678,8 @@
                 <w:iCs w:val="0"/>
                 <w:smallCaps w:val="0"/>
                 <w:strike w:val="0"/>
-                <w:color w:val="1f3864"/>
-                <w:sz w:val="22"/>
-                <w:szCs w:val="22"/>
+                <w:sz w:val="20"/>
+                <w:szCs w:val="20"/>
                 <w:u w:val="none"/>
                 <w:shd w:fill="auto" w:val="clear"/>
                 <w:vertAlign w:val="baseline"/>
@@ -4758,7 +4687,8 @@
             </w:pPr>
             <w:r>
               <w:rPr>
-                <w:color w:val="1f3864"/>
+                <w:sz w:val="20"/>
+                <w:szCs w:val="20"/>
                 <w:rtl w:val="0"/>
               </w:rPr>
               <w:t xml:space="preserve">Presentar de forma visual como luce el proyecto.</w:t>
@@ -4790,14 +4720,16 @@
               <w:rPr>
                 <w:b w:val="1"/>
                 <w:bCs w:val="1"/>
-                <w:color w:val="1f3864"/>
-              </w:rPr>
-            </w:pPr>
-            <w:r>
-              <w:rPr>
-                <w:b w:val="1"/>
-                <w:bCs w:val="1"/>
-                <w:color w:val="1f3864"/>
+                <w:sz w:val="20"/>
+                <w:szCs w:val="20"/>
+              </w:rPr>
+            </w:pPr>
+            <w:r>
+              <w:rPr>
+                <w:b w:val="1"/>
+                <w:bCs w:val="1"/>
+                <w:sz w:val="20"/>
+                <w:szCs w:val="20"/>
                 <w:rtl w:val="0"/>
               </w:rPr>
               <w:t xml:space="preserve">Avance</w:t>
@@ -4834,9 +4766,8 @@
                 <w:iCs w:val="0"/>
                 <w:smallCaps w:val="0"/>
                 <w:strike w:val="0"/>
-                <w:color w:val="1f3864"/>
-                <w:sz w:val="22"/>
-                <w:szCs w:val="22"/>
+                <w:sz w:val="20"/>
+                <w:szCs w:val="20"/>
                 <w:u w:val="none"/>
                 <w:shd w:fill="auto" w:val="clear"/>
                 <w:vertAlign w:val="baseline"/>
@@ -4846,7 +4777,8 @@
               <w:rPr>
                 <w:b w:val="1"/>
                 <w:bCs w:val="1"/>
-                <w:color w:val="1f3864"/>
+                <w:sz w:val="20"/>
+                <w:szCs w:val="20"/>
                 <w:rtl w:val="0"/>
               </w:rPr>
               <w:t xml:space="preserve">Informe ERS</w:t>
@@ -4876,9 +4808,8 @@
                 <w:iCs w:val="0"/>
                 <w:smallCaps w:val="0"/>
                 <w:strike w:val="0"/>
-                <w:color w:val="1f3864"/>
-                <w:sz w:val="22"/>
-                <w:szCs w:val="22"/>
+                <w:sz w:val="20"/>
+                <w:szCs w:val="20"/>
                 <w:u w:val="none"/>
                 <w:shd w:fill="auto" w:val="clear"/>
                 <w:vertAlign w:val="baseline"/>
@@ -4886,7 +4817,8 @@
             </w:pPr>
             <w:r>
               <w:rPr>
-                <w:color w:val="1f3864"/>
+                <w:sz w:val="20"/>
+                <w:szCs w:val="20"/>
                 <w:rtl w:val="0"/>
               </w:rPr>
               <w:t xml:space="preserve">Documento que especifica los requerimientos del sistema y la propuesta de proyecto</w:t>
@@ -4915,9 +4847,8 @@
                 <w:iCs w:val="0"/>
                 <w:smallCaps w:val="0"/>
                 <w:strike w:val="0"/>
-                <w:color w:val="1f3864"/>
-                <w:sz w:val="22"/>
-                <w:szCs w:val="22"/>
+                <w:sz w:val="20"/>
+                <w:szCs w:val="20"/>
                 <w:u w:val="none"/>
                 <w:shd w:fill="auto" w:val="clear"/>
                 <w:vertAlign w:val="baseline"/>
@@ -4925,7 +4856,8 @@
             </w:pPr>
             <w:r>
               <w:rPr>
-                <w:color w:val="1f3864"/>
+                <w:sz w:val="20"/>
+                <w:szCs w:val="20"/>
                 <w:rtl w:val="0"/>
               </w:rPr>
               <w:t xml:space="preserve">Mostrar la propuesta y especificaciones de requerimientos del proyecto a realizar.</w:t>
@@ -4957,14 +4889,16 @@
               <w:rPr>
                 <w:b w:val="1"/>
                 <w:bCs w:val="1"/>
-                <w:color w:val="1f3864"/>
-              </w:rPr>
-            </w:pPr>
-            <w:r>
-              <w:rPr>
-                <w:b w:val="1"/>
-                <w:bCs w:val="1"/>
-                <w:color w:val="1f3864"/>
+                <w:sz w:val="20"/>
+                <w:szCs w:val="20"/>
+              </w:rPr>
+            </w:pPr>
+            <w:r>
+              <w:rPr>
+                <w:b w:val="1"/>
+                <w:bCs w:val="1"/>
+                <w:sz w:val="20"/>
+                <w:szCs w:val="20"/>
                 <w:rtl w:val="0"/>
               </w:rPr>
               <w:t xml:space="preserve">Avance</w:t>
@@ -5001,9 +4935,8 @@
                 <w:iCs w:val="0"/>
                 <w:smallCaps w:val="0"/>
                 <w:strike w:val="0"/>
-                <w:color w:val="1f3864"/>
-                <w:sz w:val="22"/>
-                <w:szCs w:val="22"/>
+                <w:sz w:val="20"/>
+                <w:szCs w:val="20"/>
                 <w:u w:val="none"/>
                 <w:shd w:fill="auto" w:val="clear"/>
                 <w:vertAlign w:val="baseline"/>
@@ -5013,7 +4946,8 @@
               <w:rPr>
                 <w:b w:val="1"/>
                 <w:bCs w:val="1"/>
-                <w:color w:val="1f3864"/>
+                <w:sz w:val="20"/>
+                <w:szCs w:val="20"/>
                 <w:rtl w:val="0"/>
               </w:rPr>
               <w:t xml:space="preserve">Definición de proyecto</w:t>
@@ -5038,9 +4972,8 @@
                 <w:iCs w:val="0"/>
                 <w:smallCaps w:val="0"/>
                 <w:strike w:val="0"/>
-                <w:color w:val="1f3864"/>
-                <w:sz w:val="22"/>
-                <w:szCs w:val="22"/>
+                <w:sz w:val="20"/>
+                <w:szCs w:val="20"/>
                 <w:u w:val="none"/>
                 <w:shd w:fill="auto" w:val="clear"/>
                 <w:vertAlign w:val="baseline"/>
@@ -5048,7 +4981,8 @@
             </w:pPr>
             <w:r>
               <w:rPr>
-                <w:color w:val="073763"/>
+                <w:sz w:val="20"/>
+                <w:szCs w:val="20"/>
                 <w:rtl w:val="0"/>
               </w:rPr>
               <w:t xml:space="preserve">Documento que define el proyecto APT a realizar.</w:t>
@@ -5077,9 +5011,8 @@
                 <w:iCs w:val="0"/>
                 <w:smallCaps w:val="0"/>
                 <w:strike w:val="0"/>
-                <w:color w:val="1f3864"/>
-                <w:sz w:val="22"/>
-                <w:szCs w:val="22"/>
+                <w:sz w:val="20"/>
+                <w:szCs w:val="20"/>
                 <w:u w:val="none"/>
                 <w:shd w:fill="auto" w:val="clear"/>
                 <w:vertAlign w:val="baseline"/>
@@ -5087,7 +5020,8 @@
             </w:pPr>
             <w:r>
               <w:rPr>
-                <w:color w:val="1f3864"/>
+                <w:sz w:val="20"/>
+                <w:szCs w:val="20"/>
                 <w:rtl w:val="0"/>
               </w:rPr>
               <w:t xml:space="preserve">Definir el proyecto que se trabajará en este APT.</w:t>
@@ -5124,9 +5058,8 @@
                 <w:iCs w:val="0"/>
                 <w:smallCaps w:val="0"/>
                 <w:strike w:val="0"/>
-                <w:color w:val="1f3864"/>
-                <w:sz w:val="22"/>
-                <w:szCs w:val="22"/>
+                <w:sz w:val="20"/>
+                <w:szCs w:val="20"/>
                 <w:u w:val="none"/>
                 <w:shd w:fill="auto" w:val="clear"/>
                 <w:vertAlign w:val="baseline"/>
@@ -5136,7 +5069,8 @@
               <w:rPr>
                 <w:b w:val="1"/>
                 <w:bCs w:val="1"/>
-                <w:color w:val="1f3864"/>
+                <w:sz w:val="20"/>
+                <w:szCs w:val="20"/>
                 <w:rtl w:val="0"/>
               </w:rPr>
               <w:t xml:space="preserve">Avance</w:t>
@@ -5178,9 +5112,8 @@
                 <w:iCs w:val="0"/>
                 <w:smallCaps w:val="0"/>
                 <w:strike w:val="0"/>
-                <w:color w:val="1f3864"/>
-                <w:sz w:val="22"/>
-                <w:szCs w:val="22"/>
+                <w:sz w:val="20"/>
+                <w:szCs w:val="20"/>
                 <w:u w:val="none"/>
                 <w:shd w:fill="auto" w:val="clear"/>
                 <w:vertAlign w:val="baseline"/>
@@ -5190,7 +5123,8 @@
               <w:rPr>
                 <w:b w:val="1"/>
                 <w:bCs w:val="1"/>
-                <w:color w:val="1f3864"/>
+                <w:sz w:val="20"/>
+                <w:szCs w:val="20"/>
                 <w:rtl w:val="0"/>
               </w:rPr>
               <w:t xml:space="preserve">Caso de uso extendido</w:t>
@@ -5220,9 +5154,8 @@
                 <w:iCs w:val="0"/>
                 <w:smallCaps w:val="0"/>
                 <w:strike w:val="0"/>
-                <w:color w:val="1f3864"/>
-                <w:sz w:val="22"/>
-                <w:szCs w:val="22"/>
+                <w:sz w:val="20"/>
+                <w:szCs w:val="20"/>
                 <w:u w:val="none"/>
                 <w:shd w:fill="auto" w:val="clear"/>
                 <w:vertAlign w:val="baseline"/>
@@ -5230,7 +5163,8 @@
             </w:pPr>
             <w:r>
               <w:rPr>
-                <w:color w:val="1f3864"/>
+                <w:sz w:val="20"/>
+                <w:szCs w:val="20"/>
                 <w:rtl w:val="0"/>
               </w:rPr>
               <w:t xml:space="preserve">Documento que describe las interacciones del usuario con el sistema.</w:t>
@@ -5259,9 +5193,8 @@
                 <w:iCs w:val="0"/>
                 <w:smallCaps w:val="0"/>
                 <w:strike w:val="0"/>
-                <w:color w:val="1f3864"/>
-                <w:sz w:val="22"/>
-                <w:szCs w:val="22"/>
+                <w:sz w:val="20"/>
+                <w:szCs w:val="20"/>
                 <w:u w:val="none"/>
                 <w:shd w:fill="auto" w:val="clear"/>
                 <w:vertAlign w:val="baseline"/>
@@ -5269,7 +5202,8 @@
             </w:pPr>
             <w:r>
               <w:rPr>
-                <w:color w:val="1f3864"/>
+                <w:sz w:val="20"/>
+                <w:szCs w:val="20"/>
                 <w:rtl w:val="0"/>
               </w:rPr>
               <w:t xml:space="preserve">Presentar las interacciones del usuario con el sistema.</w:t>
@@ -5283,6 +5217,26 @@
         </w:tc>
       </w:tr>
     </w:tbl>
+    <w:p>
+      <w:pPr>
+        <w:spacing w:after="0" w:line="360" w:lineRule="auto"/>
+        <w:jc w:val="both"/>
+        <w:rPr>
+          <w:b w:val="1"/>
+          <w:bCs w:val="1"/>
+          <w:sz w:val="24"/>
+          <w:szCs w:val="24"/>
+        </w:rPr>
+      </w:pPr>
+      <w:r>
+        <w:br w:type="page"/>
+      </w:r>
+      <w:r>
+        <w:rPr>
+          <w:rtl w:val="0"/>
+        </w:rPr>
+      </w:r>
+    </w:p>
     <w:p>
       <w:pPr>
         <w:spacing w:after="0" w:line="360" w:lineRule="auto"/>
@@ -5864,26 +5818,23 @@
           <w:tcPr/>
           <w:p>
             <w:pPr>
-              <w:jc w:val="both"/>
               <w:rPr>
                 <w:rFonts w:ascii="Calibri" w:cs="Calibri" w:eastAsia="Calibri" w:hAnsi="Calibri"/>
                 <w:i w:val="1"/>
                 <w:iCs w:val="1"/>
-                <w:color w:val="548dd4"/>
-                <w:sz w:val="18"/>
-                <w:szCs w:val="18"/>
-              </w:rPr>
-            </w:pPr>
-            <w:r>
-              <w:rPr>
-                <w:i w:val="1"/>
-                <w:iCs w:val="1"/>
-                <w:color w:val="548dd4"/>
-                <w:sz w:val="18"/>
-                <w:szCs w:val="18"/>
-                <w:rtl w:val="0"/>
-              </w:rPr>
-              <w:t xml:space="preserve">Nombra los recursos necesarios para llevar a cabo las actividades definidas.</w:t>
+                <w:sz w:val="18"/>
+                <w:szCs w:val="18"/>
+              </w:rPr>
+            </w:pPr>
+            <w:r>
+              <w:rPr>
+                <w:i w:val="1"/>
+                <w:iCs w:val="1"/>
+                <w:sz w:val="18"/>
+                <w:szCs w:val="18"/>
+                <w:rtl w:val="0"/>
+              </w:rPr>
+              <w:t xml:space="preserve">Plantilla de documento y ordenador</w:t>
             </w:r>
             <w:r>
               <w:rPr>
@@ -5965,26 +5916,23 @@
           <w:tcPr/>
           <w:p>
             <w:pPr>
-              <w:jc w:val="both"/>
               <w:rPr>
                 <w:rFonts w:ascii="Calibri" w:cs="Calibri" w:eastAsia="Calibri" w:hAnsi="Calibri"/>
                 <w:i w:val="1"/>
                 <w:iCs w:val="1"/>
-                <w:color w:val="548dd4"/>
-                <w:sz w:val="18"/>
-                <w:szCs w:val="18"/>
-              </w:rPr>
-            </w:pPr>
-            <w:r>
-              <w:rPr>
-                <w:i w:val="1"/>
-                <w:iCs w:val="1"/>
-                <w:color w:val="548dd4"/>
-                <w:sz w:val="18"/>
-                <w:szCs w:val="18"/>
-                <w:rtl w:val="0"/>
-              </w:rPr>
-              <w:t xml:space="preserve">Escribe las dificultades o facilitadores que se podrían presentar durante la ejecución de cada una de las actividades propuestas para llevar a cabo el plan de trabajo.</w:t>
+                <w:sz w:val="18"/>
+                <w:szCs w:val="18"/>
+              </w:rPr>
+            </w:pPr>
+            <w:r>
+              <w:rPr>
+                <w:i w:val="1"/>
+                <w:iCs w:val="1"/>
+                <w:sz w:val="18"/>
+                <w:szCs w:val="18"/>
+                <w:rtl w:val="0"/>
+              </w:rPr>
+              <w:t xml:space="preserve">El discutir funciones teóricas se dificulta el definir que es posible y como se debería desarrollar.</w:t>
             </w:r>
             <w:r>
               <w:rPr>
@@ -6137,20 +6085,22 @@
           <w:tcPr/>
           <w:p>
             <w:pPr>
-              <w:jc w:val="both"/>
-              <w:rPr>
-                <w:rFonts w:ascii="Calibri" w:cs="Calibri" w:eastAsia="Calibri" w:hAnsi="Calibri"/>
-                <w:i w:val="1"/>
-                <w:iCs w:val="1"/>
-                <w:color w:val="548dd4"/>
-                <w:sz w:val="18"/>
-                <w:szCs w:val="18"/>
-              </w:rPr>
-            </w:pPr>
-            <w:r>
-              <w:rPr>
-                <w:rtl w:val="0"/>
-              </w:rPr>
+              <w:rPr>
+                <w:i w:val="1"/>
+                <w:iCs w:val="1"/>
+                <w:sz w:val="18"/>
+                <w:szCs w:val="18"/>
+              </w:rPr>
+            </w:pPr>
+            <w:r>
+              <w:rPr>
+                <w:i w:val="1"/>
+                <w:iCs w:val="1"/>
+                <w:sz w:val="18"/>
+                <w:szCs w:val="18"/>
+                <w:rtl w:val="0"/>
+              </w:rPr>
+              <w:t xml:space="preserve">Documento y ordenador</w:t>
             </w:r>
           </w:p>
         </w:tc>
@@ -6228,16 +6178,24 @@
           <w:tcPr/>
           <w:p>
             <w:pPr>
-              <w:jc w:val="both"/>
               <w:rPr>
                 <w:rFonts w:ascii="Calibri" w:cs="Calibri" w:eastAsia="Calibri" w:hAnsi="Calibri"/>
                 <w:i w:val="1"/>
                 <w:iCs w:val="1"/>
-                <w:color w:val="548dd4"/>
-                <w:sz w:val="18"/>
-                <w:szCs w:val="18"/>
-              </w:rPr>
-            </w:pPr>
+                <w:sz w:val="18"/>
+                <w:szCs w:val="18"/>
+              </w:rPr>
+            </w:pPr>
+            <w:r>
+              <w:rPr>
+                <w:i w:val="1"/>
+                <w:iCs w:val="1"/>
+                <w:sz w:val="18"/>
+                <w:szCs w:val="18"/>
+                <w:rtl w:val="0"/>
+              </w:rPr>
+              <w:t xml:space="preserve">La participación de la responsable de aprobar el acta en la creación del documento facilita su aprobación.</w:t>
+            </w:r>
             <w:r>
               <w:rPr>
                 <w:rtl w:val="0"/>
@@ -6396,20 +6354,22 @@
           <w:tcPr/>
           <w:p>
             <w:pPr>
-              <w:jc w:val="both"/>
-              <w:rPr>
-                <w:rFonts w:ascii="Calibri" w:cs="Calibri" w:eastAsia="Calibri" w:hAnsi="Calibri"/>
-                <w:i w:val="1"/>
-                <w:iCs w:val="1"/>
-                <w:color w:val="548dd4"/>
-                <w:sz w:val="18"/>
-                <w:szCs w:val="18"/>
-              </w:rPr>
-            </w:pPr>
-            <w:r>
-              <w:rPr>
-                <w:rtl w:val="0"/>
-              </w:rPr>
+              <w:rPr>
+                <w:i w:val="1"/>
+                <w:iCs w:val="1"/>
+                <w:sz w:val="18"/>
+                <w:szCs w:val="18"/>
+              </w:rPr>
+            </w:pPr>
+            <w:r>
+              <w:rPr>
+                <w:i w:val="1"/>
+                <w:iCs w:val="1"/>
+                <w:sz w:val="18"/>
+                <w:szCs w:val="18"/>
+                <w:rtl w:val="0"/>
+              </w:rPr>
+              <w:t xml:space="preserve">Plantilla de documento y ordenador</w:t>
             </w:r>
           </w:p>
         </w:tc>
@@ -6481,16 +6441,24 @@
           <w:tcPr/>
           <w:p>
             <w:pPr>
-              <w:jc w:val="both"/>
               <w:rPr>
                 <w:rFonts w:ascii="Calibri" w:cs="Calibri" w:eastAsia="Calibri" w:hAnsi="Calibri"/>
                 <w:i w:val="1"/>
                 <w:iCs w:val="1"/>
-                <w:color w:val="548dd4"/>
-                <w:sz w:val="18"/>
-                <w:szCs w:val="18"/>
-              </w:rPr>
-            </w:pPr>
+                <w:sz w:val="18"/>
+                <w:szCs w:val="18"/>
+              </w:rPr>
+            </w:pPr>
+            <w:r>
+              <w:rPr>
+                <w:i w:val="1"/>
+                <w:iCs w:val="1"/>
+                <w:sz w:val="18"/>
+                <w:szCs w:val="18"/>
+                <w:rtl w:val="0"/>
+              </w:rPr>
+              <w:t xml:space="preserve">No tener documentos o mockups para organizar las ideas dificulta definir todos los requerimientos necesarios.</w:t>
+            </w:r>
             <w:r>
               <w:rPr>
                 <w:rtl w:val="0"/>
@@ -6649,16 +6617,24 @@
           <w:tcPr/>
           <w:p>
             <w:pPr>
-              <w:jc w:val="both"/>
               <w:rPr>
                 <w:rFonts w:ascii="Calibri" w:cs="Calibri" w:eastAsia="Calibri" w:hAnsi="Calibri"/>
                 <w:i w:val="1"/>
                 <w:iCs w:val="1"/>
-                <w:color w:val="548dd4"/>
-                <w:sz w:val="18"/>
-                <w:szCs w:val="18"/>
-              </w:rPr>
-            </w:pPr>
+                <w:sz w:val="18"/>
+                <w:szCs w:val="18"/>
+              </w:rPr>
+            </w:pPr>
+            <w:r>
+              <w:rPr>
+                <w:i w:val="1"/>
+                <w:iCs w:val="1"/>
+                <w:sz w:val="18"/>
+                <w:szCs w:val="18"/>
+                <w:rtl w:val="0"/>
+              </w:rPr>
+              <w:t xml:space="preserve">Acta de constitución y aprobación de los integrantes del equipo</w:t>
+            </w:r>
             <w:r>
               <w:rPr>
                 <w:rtl w:val="0"/>
@@ -6734,16 +6710,24 @@
           <w:tcPr/>
           <w:p>
             <w:pPr>
-              <w:jc w:val="both"/>
               <w:rPr>
                 <w:rFonts w:ascii="Calibri" w:cs="Calibri" w:eastAsia="Calibri" w:hAnsi="Calibri"/>
                 <w:i w:val="1"/>
                 <w:iCs w:val="1"/>
-                <w:color w:val="548dd4"/>
-                <w:sz w:val="18"/>
-                <w:szCs w:val="18"/>
-              </w:rPr>
-            </w:pPr>
+                <w:sz w:val="18"/>
+                <w:szCs w:val="18"/>
+              </w:rPr>
+            </w:pPr>
+            <w:r>
+              <w:rPr>
+                <w:i w:val="1"/>
+                <w:iCs w:val="1"/>
+                <w:sz w:val="18"/>
+                <w:szCs w:val="18"/>
+                <w:rtl w:val="0"/>
+              </w:rPr>
+              <w:t xml:space="preserve">Los integrantes ya estaban definidos, solo hacia falta especificar los roles de cada uno.</w:t>
+            </w:r>
             <w:r>
               <w:rPr>
                 <w:rtl w:val="0"/>
@@ -6902,16 +6886,24 @@
           <w:tcPr/>
           <w:p>
             <w:pPr>
-              <w:jc w:val="both"/>
               <w:rPr>
                 <w:rFonts w:ascii="Calibri" w:cs="Calibri" w:eastAsia="Calibri" w:hAnsi="Calibri"/>
                 <w:i w:val="1"/>
                 <w:iCs w:val="1"/>
-                <w:color w:val="548dd4"/>
-                <w:sz w:val="18"/>
-                <w:szCs w:val="18"/>
-              </w:rPr>
-            </w:pPr>
+                <w:sz w:val="18"/>
+                <w:szCs w:val="18"/>
+              </w:rPr>
+            </w:pPr>
+            <w:r>
+              <w:rPr>
+                <w:i w:val="1"/>
+                <w:iCs w:val="1"/>
+                <w:sz w:val="18"/>
+                <w:szCs w:val="18"/>
+                <w:rtl w:val="0"/>
+              </w:rPr>
+              <w:t xml:space="preserve">Plantilla de documento y ordenador</w:t>
+            </w:r>
             <w:r>
               <w:rPr>
                 <w:rtl w:val="0"/>
@@ -6993,16 +6985,24 @@
           <w:tcPr/>
           <w:p>
             <w:pPr>
-              <w:jc w:val="both"/>
               <w:rPr>
                 <w:rFonts w:ascii="Calibri" w:cs="Calibri" w:eastAsia="Calibri" w:hAnsi="Calibri"/>
                 <w:i w:val="1"/>
                 <w:iCs w:val="1"/>
-                <w:color w:val="548dd4"/>
-                <w:sz w:val="18"/>
-                <w:szCs w:val="18"/>
-              </w:rPr>
-            </w:pPr>
+                <w:sz w:val="18"/>
+                <w:szCs w:val="18"/>
+              </w:rPr>
+            </w:pPr>
+            <w:r>
+              <w:rPr>
+                <w:i w:val="1"/>
+                <w:iCs w:val="1"/>
+                <w:sz w:val="18"/>
+                <w:szCs w:val="18"/>
+                <w:rtl w:val="0"/>
+              </w:rPr>
+              <w:t xml:space="preserve">Si bien se pueden incluir nuevos requerimientos o corregir antiguos, se deben esperar cambios a futuro.</w:t>
+            </w:r>
             <w:r>
               <w:rPr>
                 <w:rtl w:val="0"/>
@@ -7187,16 +7187,24 @@
           <w:tcPr/>
           <w:p>
             <w:pPr>
-              <w:jc w:val="both"/>
               <w:rPr>
                 <w:rFonts w:ascii="Calibri" w:cs="Calibri" w:eastAsia="Calibri" w:hAnsi="Calibri"/>
                 <w:i w:val="1"/>
                 <w:iCs w:val="1"/>
-                <w:color w:val="548dd4"/>
-                <w:sz w:val="18"/>
-                <w:szCs w:val="18"/>
-              </w:rPr>
-            </w:pPr>
+                <w:sz w:val="18"/>
+                <w:szCs w:val="18"/>
+              </w:rPr>
+            </w:pPr>
+            <w:r>
+              <w:rPr>
+                <w:i w:val="1"/>
+                <w:iCs w:val="1"/>
+                <w:sz w:val="18"/>
+                <w:szCs w:val="18"/>
+                <w:rtl w:val="0"/>
+              </w:rPr>
+              <w:t xml:space="preserve">Plantilla de documento y ordenador</w:t>
+            </w:r>
             <w:r>
               <w:rPr>
                 <w:rtl w:val="0"/>
@@ -7278,16 +7286,24 @@
           <w:tcPr/>
           <w:p>
             <w:pPr>
-              <w:jc w:val="both"/>
               <w:rPr>
                 <w:rFonts w:ascii="Calibri" w:cs="Calibri" w:eastAsia="Calibri" w:hAnsi="Calibri"/>
                 <w:i w:val="1"/>
                 <w:iCs w:val="1"/>
-                <w:color w:val="548dd4"/>
-                <w:sz w:val="18"/>
-                <w:szCs w:val="18"/>
-              </w:rPr>
-            </w:pPr>
+                <w:sz w:val="18"/>
+                <w:szCs w:val="18"/>
+              </w:rPr>
+            </w:pPr>
+            <w:r>
+              <w:rPr>
+                <w:i w:val="1"/>
+                <w:iCs w:val="1"/>
+                <w:sz w:val="18"/>
+                <w:szCs w:val="18"/>
+                <w:rtl w:val="0"/>
+              </w:rPr>
+              <w:t xml:space="preserve">Pudimos basarnos en la arquitectura de otras aplicaciones moviles.</w:t>
+            </w:r>
             <w:r>
               <w:rPr>
                 <w:rtl w:val="0"/>
@@ -7472,16 +7488,24 @@
           <w:tcPr/>
           <w:p>
             <w:pPr>
-              <w:jc w:val="both"/>
               <w:rPr>
                 <w:rFonts w:ascii="Calibri" w:cs="Calibri" w:eastAsia="Calibri" w:hAnsi="Calibri"/>
                 <w:i w:val="1"/>
                 <w:iCs w:val="1"/>
-                <w:color w:val="548dd4"/>
-                <w:sz w:val="18"/>
-                <w:szCs w:val="18"/>
-              </w:rPr>
-            </w:pPr>
+                <w:sz w:val="18"/>
+                <w:szCs w:val="18"/>
+              </w:rPr>
+            </w:pPr>
+            <w:r>
+              <w:rPr>
+                <w:i w:val="1"/>
+                <w:iCs w:val="1"/>
+                <w:sz w:val="18"/>
+                <w:szCs w:val="18"/>
+                <w:rtl w:val="0"/>
+              </w:rPr>
+              <w:t xml:space="preserve">Plantilla de documento y ordenador</w:t>
+            </w:r>
             <w:r>
               <w:rPr>
                 <w:rtl w:val="0"/>
@@ -7563,16 +7587,24 @@
           <w:tcPr/>
           <w:p>
             <w:pPr>
-              <w:jc w:val="both"/>
               <w:rPr>
                 <w:rFonts w:ascii="Calibri" w:cs="Calibri" w:eastAsia="Calibri" w:hAnsi="Calibri"/>
                 <w:i w:val="1"/>
                 <w:iCs w:val="1"/>
-                <w:color w:val="548dd4"/>
-                <w:sz w:val="18"/>
-                <w:szCs w:val="18"/>
-              </w:rPr>
-            </w:pPr>
+                <w:sz w:val="18"/>
+                <w:szCs w:val="18"/>
+              </w:rPr>
+            </w:pPr>
+            <w:r>
+              <w:rPr>
+                <w:i w:val="1"/>
+                <w:iCs w:val="1"/>
+                <w:sz w:val="18"/>
+                <w:szCs w:val="18"/>
+                <w:rtl w:val="0"/>
+              </w:rPr>
+              <w:t xml:space="preserve">La definición de requerimientos facilita saber cuantos casos de uso son necesarios y que deben hacer.</w:t>
+            </w:r>
             <w:r>
               <w:rPr>
                 <w:rtl w:val="0"/>
@@ -7757,16 +7789,24 @@
           <w:tcPr/>
           <w:p>
             <w:pPr>
-              <w:jc w:val="both"/>
               <w:rPr>
                 <w:rFonts w:ascii="Calibri" w:cs="Calibri" w:eastAsia="Calibri" w:hAnsi="Calibri"/>
                 <w:i w:val="1"/>
                 <w:iCs w:val="1"/>
-                <w:color w:val="548dd4"/>
-                <w:sz w:val="18"/>
-                <w:szCs w:val="18"/>
-              </w:rPr>
-            </w:pPr>
+                <w:sz w:val="18"/>
+                <w:szCs w:val="18"/>
+              </w:rPr>
+            </w:pPr>
+            <w:r>
+              <w:rPr>
+                <w:i w:val="1"/>
+                <w:iCs w:val="1"/>
+                <w:sz w:val="18"/>
+                <w:szCs w:val="18"/>
+                <w:rtl w:val="0"/>
+              </w:rPr>
+              <w:t xml:space="preserve">Canva y ordenador</w:t>
+            </w:r>
             <w:r>
               <w:rPr>
                 <w:rtl w:val="0"/>
@@ -7842,16 +7882,24 @@
           <w:tcPr/>
           <w:p>
             <w:pPr>
-              <w:jc w:val="both"/>
               <w:rPr>
                 <w:rFonts w:ascii="Calibri" w:cs="Calibri" w:eastAsia="Calibri" w:hAnsi="Calibri"/>
                 <w:i w:val="1"/>
                 <w:iCs w:val="1"/>
-                <w:color w:val="548dd4"/>
-                <w:sz w:val="18"/>
-                <w:szCs w:val="18"/>
-              </w:rPr>
-            </w:pPr>
+                <w:sz w:val="18"/>
+                <w:szCs w:val="18"/>
+              </w:rPr>
+            </w:pPr>
+            <w:r>
+              <w:rPr>
+                <w:i w:val="1"/>
+                <w:iCs w:val="1"/>
+                <w:sz w:val="18"/>
+                <w:szCs w:val="18"/>
+                <w:rtl w:val="0"/>
+              </w:rPr>
+              <w:t xml:space="preserve">El proceso de diseño ayuda a visualizar la aplicación y con esto sus funciones.</w:t>
+            </w:r>
             <w:r>
               <w:rPr>
                 <w:rtl w:val="0"/>
@@ -8010,16 +8058,24 @@
           <w:tcPr/>
           <w:p>
             <w:pPr>
-              <w:jc w:val="both"/>
               <w:rPr>
                 <w:rFonts w:ascii="Calibri" w:cs="Calibri" w:eastAsia="Calibri" w:hAnsi="Calibri"/>
                 <w:i w:val="1"/>
                 <w:iCs w:val="1"/>
-                <w:color w:val="548dd4"/>
-                <w:sz w:val="18"/>
-                <w:szCs w:val="18"/>
-              </w:rPr>
-            </w:pPr>
+                <w:sz w:val="18"/>
+                <w:szCs w:val="18"/>
+              </w:rPr>
+            </w:pPr>
+            <w:r>
+              <w:rPr>
+                <w:i w:val="1"/>
+                <w:iCs w:val="1"/>
+                <w:sz w:val="18"/>
+                <w:szCs w:val="18"/>
+                <w:rtl w:val="0"/>
+              </w:rPr>
+              <w:t xml:space="preserve">Plantilla de documento y ordenador</w:t>
+            </w:r>
             <w:r>
               <w:rPr>
                 <w:rtl w:val="0"/>
@@ -8095,16 +8151,24 @@
           <w:tcPr/>
           <w:p>
             <w:pPr>
-              <w:jc w:val="both"/>
               <w:rPr>
                 <w:rFonts w:ascii="Calibri" w:cs="Calibri" w:eastAsia="Calibri" w:hAnsi="Calibri"/>
                 <w:i w:val="1"/>
                 <w:iCs w:val="1"/>
-                <w:color w:val="548dd4"/>
-                <w:sz w:val="18"/>
-                <w:szCs w:val="18"/>
-              </w:rPr>
-            </w:pPr>
+                <w:sz w:val="18"/>
+                <w:szCs w:val="18"/>
+              </w:rPr>
+            </w:pPr>
+            <w:r>
+              <w:rPr>
+                <w:i w:val="1"/>
+                <w:iCs w:val="1"/>
+                <w:sz w:val="18"/>
+                <w:szCs w:val="18"/>
+                <w:rtl w:val="0"/>
+              </w:rPr>
+              <w:t xml:space="preserve">Permite unificar todos los aspectos más relevantes del proyecto en un documento.</w:t>
+            </w:r>
             <w:r>
               <w:rPr>
                 <w:rtl w:val="0"/>
@@ -8263,16 +8327,44 @@
           <w:tcPr/>
           <w:p>
             <w:pPr>
-              <w:jc w:val="both"/>
+              <w:rPr>
+                <w:i w:val="1"/>
+                <w:iCs w:val="1"/>
+                <w:sz w:val="18"/>
+                <w:szCs w:val="18"/>
+              </w:rPr>
+            </w:pPr>
+            <w:r>
+              <w:rPr>
+                <w:i w:val="1"/>
+                <w:iCs w:val="1"/>
+                <w:sz w:val="18"/>
+                <w:szCs w:val="18"/>
+                <w:rtl w:val="0"/>
+              </w:rPr>
+              <w:t xml:space="preserve">Android Studio, </w:t>
+            </w:r>
+          </w:p>
+          <w:p>
+            <w:pPr>
               <w:rPr>
                 <w:rFonts w:ascii="Calibri" w:cs="Calibri" w:eastAsia="Calibri" w:hAnsi="Calibri"/>
                 <w:i w:val="1"/>
                 <w:iCs w:val="1"/>
-                <w:color w:val="548dd4"/>
-                <w:sz w:val="18"/>
-                <w:szCs w:val="18"/>
-              </w:rPr>
-            </w:pPr>
+                <w:sz w:val="18"/>
+                <w:szCs w:val="18"/>
+              </w:rPr>
+            </w:pPr>
+            <w:r>
+              <w:rPr>
+                <w:i w:val="1"/>
+                <w:iCs w:val="1"/>
+                <w:sz w:val="18"/>
+                <w:szCs w:val="18"/>
+                <w:rtl w:val="0"/>
+              </w:rPr>
+              <w:t xml:space="preserve">Github, Visual Studio Code, ordenador</w:t>
+            </w:r>
             <w:r>
               <w:rPr>
                 <w:rtl w:val="0"/>
@@ -8348,16 +8440,24 @@
           <w:tcPr/>
           <w:p>
             <w:pPr>
-              <w:jc w:val="both"/>
               <w:rPr>
                 <w:rFonts w:ascii="Calibri" w:cs="Calibri" w:eastAsia="Calibri" w:hAnsi="Calibri"/>
                 <w:i w:val="1"/>
                 <w:iCs w:val="1"/>
-                <w:color w:val="548dd4"/>
-                <w:sz w:val="18"/>
-                <w:szCs w:val="18"/>
-              </w:rPr>
-            </w:pPr>
+                <w:sz w:val="18"/>
+                <w:szCs w:val="18"/>
+              </w:rPr>
+            </w:pPr>
+            <w:r>
+              <w:rPr>
+                <w:i w:val="1"/>
+                <w:iCs w:val="1"/>
+                <w:sz w:val="18"/>
+                <w:szCs w:val="18"/>
+                <w:rtl w:val="0"/>
+              </w:rPr>
+              <w:t xml:space="preserve">Necesario para trabajar a la par y evitar inconsistencias.</w:t>
+            </w:r>
             <w:r>
               <w:rPr>
                 <w:rtl w:val="0"/>
@@ -8490,20 +8590,22 @@
           <w:tcPr/>
           <w:p>
             <w:pPr>
-              <w:jc w:val="both"/>
-              <w:rPr>
-                <w:rFonts w:ascii="Calibri" w:cs="Calibri" w:eastAsia="Calibri" w:hAnsi="Calibri"/>
-                <w:i w:val="1"/>
-                <w:iCs w:val="1"/>
-                <w:color w:val="548dd4"/>
-                <w:sz w:val="18"/>
-                <w:szCs w:val="18"/>
-              </w:rPr>
-            </w:pPr>
-            <w:r>
-              <w:rPr>
-                <w:rtl w:val="0"/>
-              </w:rPr>
+              <w:rPr>
+                <w:i w:val="1"/>
+                <w:iCs w:val="1"/>
+                <w:sz w:val="18"/>
+                <w:szCs w:val="18"/>
+              </w:rPr>
+            </w:pPr>
+            <w:r>
+              <w:rPr>
+                <w:i w:val="1"/>
+                <w:iCs w:val="1"/>
+                <w:sz w:val="18"/>
+                <w:szCs w:val="18"/>
+                <w:rtl w:val="0"/>
+              </w:rPr>
+              <w:t xml:space="preserve">Interfaz sql (SQLite, PostgreSQL, etc), ordenador</w:t>
             </w:r>
           </w:p>
         </w:tc>
@@ -8575,16 +8677,24 @@
           <w:tcPr/>
           <w:p>
             <w:pPr>
-              <w:jc w:val="both"/>
               <w:rPr>
                 <w:rFonts w:ascii="Calibri" w:cs="Calibri" w:eastAsia="Calibri" w:hAnsi="Calibri"/>
                 <w:i w:val="1"/>
                 <w:iCs w:val="1"/>
-                <w:color w:val="548dd4"/>
-                <w:sz w:val="18"/>
-                <w:szCs w:val="18"/>
-              </w:rPr>
-            </w:pPr>
+                <w:sz w:val="18"/>
+                <w:szCs w:val="18"/>
+              </w:rPr>
+            </w:pPr>
+            <w:r>
+              <w:rPr>
+                <w:i w:val="1"/>
+                <w:iCs w:val="1"/>
+                <w:sz w:val="18"/>
+                <w:szCs w:val="18"/>
+                <w:rtl w:val="0"/>
+              </w:rPr>
+              <w:t xml:space="preserve">Al no tener una idea clara de cual es la mejor forma de manejar los datos, las tablas deben ser revisadas repetidamente.</w:t>
+            </w:r>
             <w:r>
               <w:rPr>
                 <w:rtl w:val="0"/>
@@ -8717,16 +8827,24 @@
           <w:tcPr/>
           <w:p>
             <w:pPr>
-              <w:jc w:val="both"/>
               <w:rPr>
                 <w:rFonts w:ascii="Calibri" w:cs="Calibri" w:eastAsia="Calibri" w:hAnsi="Calibri"/>
                 <w:i w:val="1"/>
                 <w:iCs w:val="1"/>
-                <w:color w:val="548dd4"/>
-                <w:sz w:val="18"/>
-                <w:szCs w:val="18"/>
-              </w:rPr>
-            </w:pPr>
+                <w:sz w:val="18"/>
+                <w:szCs w:val="18"/>
+              </w:rPr>
+            </w:pPr>
+            <w:r>
+              <w:rPr>
+                <w:i w:val="1"/>
+                <w:iCs w:val="1"/>
+                <w:sz w:val="18"/>
+                <w:szCs w:val="18"/>
+                <w:rtl w:val="0"/>
+              </w:rPr>
+              <w:t xml:space="preserve">interfaz sql (SQLite, PostgreSQL, etc), ordenador</w:t>
+            </w:r>
             <w:r>
               <w:rPr>
                 <w:rtl w:val="0"/>
@@ -8780,6 +8898,29 @@
             <w:pPr>
               <w:jc w:val="both"/>
               <w:rPr>
+                <w:i w:val="1"/>
+                <w:iCs w:val="1"/>
+                <w:sz w:val="18"/>
+                <w:szCs w:val="18"/>
+              </w:rPr>
+            </w:pPr>
+            <w:r>
+              <w:rPr>
+                <w:i w:val="1"/>
+                <w:iCs w:val="1"/>
+                <w:sz w:val="18"/>
+                <w:szCs w:val="18"/>
+                <w:rtl w:val="0"/>
+              </w:rPr>
+              <w:t xml:space="preserve">Vicente y Roberto</w:t>
+            </w:r>
+          </w:p>
+        </w:tc>
+        <w:tc>
+          <w:tcPr/>
+          <w:p>
+            <w:pPr>
+              <w:rPr>
                 <w:rFonts w:ascii="Calibri" w:cs="Calibri" w:eastAsia="Calibri" w:hAnsi="Calibri"/>
                 <w:i w:val="1"/>
                 <w:iCs w:val="1"/>
@@ -8789,25 +8930,14 @@
             </w:pPr>
             <w:r>
               <w:rPr>
-                <w:rtl w:val="0"/>
-              </w:rPr>
-            </w:r>
-          </w:p>
-        </w:tc>
-        <w:tc>
-          <w:tcPr/>
-          <w:p>
-            <w:pPr>
-              <w:jc w:val="both"/>
-              <w:rPr>
-                <w:rFonts w:ascii="Calibri" w:cs="Calibri" w:eastAsia="Calibri" w:hAnsi="Calibri"/>
-                <w:i w:val="1"/>
-                <w:iCs w:val="1"/>
-                <w:color w:val="548dd4"/>
-                <w:sz w:val="18"/>
-                <w:szCs w:val="18"/>
-              </w:rPr>
-            </w:pPr>
+                <w:i w:val="1"/>
+                <w:iCs w:val="1"/>
+                <w:sz w:val="18"/>
+                <w:szCs w:val="18"/>
+                <w:rtl w:val="0"/>
+              </w:rPr>
+              <w:t xml:space="preserve">Al ser un requerimiento común en las aplicaciones en general es más fácil implementar.</w:t>
+            </w:r>
             <w:r>
               <w:rPr>
                 <w:rtl w:val="0"/>
@@ -8969,7 +9099,7 @@
                 <w:between w:color="auto" w:space="7" w:sz="0" w:val="none"/>
               </w:pBdr>
               <w:shd w:fill="ffffff" w:val="clear"/>
-              <w:spacing w:after="0" w:before="180" w:lineRule="auto"/>
+              <w:spacing w:after="0" w:before="0" w:lineRule="auto"/>
               <w:rPr>
                 <w:i w:val="1"/>
                 <w:iCs w:val="1"/>
@@ -9016,16 +9146,24 @@
           <w:tcPr/>
           <w:p>
             <w:pPr>
-              <w:jc w:val="both"/>
               <w:rPr>
                 <w:rFonts w:ascii="Calibri" w:cs="Calibri" w:eastAsia="Calibri" w:hAnsi="Calibri"/>
                 <w:i w:val="1"/>
                 <w:iCs w:val="1"/>
-                <w:color w:val="548dd4"/>
-                <w:sz w:val="18"/>
-                <w:szCs w:val="18"/>
-              </w:rPr>
-            </w:pPr>
+                <w:sz w:val="18"/>
+                <w:szCs w:val="18"/>
+              </w:rPr>
+            </w:pPr>
+            <w:r>
+              <w:rPr>
+                <w:i w:val="1"/>
+                <w:iCs w:val="1"/>
+                <w:sz w:val="18"/>
+                <w:szCs w:val="18"/>
+                <w:rtl w:val="0"/>
+              </w:rPr>
+              <w:t xml:space="preserve">Android Studio, Visual Studio Code, ordenador</w:t>
+            </w:r>
             <w:r>
               <w:rPr>
                 <w:rtl w:val="0"/>
@@ -9101,16 +9239,24 @@
           <w:tcPr/>
           <w:p>
             <w:pPr>
-              <w:jc w:val="both"/>
               <w:rPr>
                 <w:rFonts w:ascii="Calibri" w:cs="Calibri" w:eastAsia="Calibri" w:hAnsi="Calibri"/>
                 <w:i w:val="1"/>
                 <w:iCs w:val="1"/>
-                <w:color w:val="548dd4"/>
-                <w:sz w:val="18"/>
-                <w:szCs w:val="18"/>
-              </w:rPr>
-            </w:pPr>
+                <w:sz w:val="18"/>
+                <w:szCs w:val="18"/>
+              </w:rPr>
+            </w:pPr>
+            <w:r>
+              <w:rPr>
+                <w:i w:val="1"/>
+                <w:iCs w:val="1"/>
+                <w:sz w:val="18"/>
+                <w:szCs w:val="18"/>
+                <w:rtl w:val="0"/>
+              </w:rPr>
+              <w:t xml:space="preserve">Optar por funcionalidades de terceros (Google, Apple) para el proceso de Inicio de sesión puede facilitar el mismo.</w:t>
+            </w:r>
             <w:r>
               <w:rPr>
                 <w:rtl w:val="0"/>
@@ -9269,16 +9415,24 @@
           <w:tcPr/>
           <w:p>
             <w:pPr>
-              <w:jc w:val="both"/>
               <w:rPr>
                 <w:rFonts w:ascii="Calibri" w:cs="Calibri" w:eastAsia="Calibri" w:hAnsi="Calibri"/>
                 <w:i w:val="1"/>
                 <w:iCs w:val="1"/>
-                <w:color w:val="548dd4"/>
-                <w:sz w:val="18"/>
-                <w:szCs w:val="18"/>
-              </w:rPr>
-            </w:pPr>
+                <w:sz w:val="18"/>
+                <w:szCs w:val="18"/>
+              </w:rPr>
+            </w:pPr>
+            <w:r>
+              <w:rPr>
+                <w:i w:val="1"/>
+                <w:iCs w:val="1"/>
+                <w:sz w:val="18"/>
+                <w:szCs w:val="18"/>
+                <w:rtl w:val="0"/>
+              </w:rPr>
+              <w:t xml:space="preserve">Android Studio, Visual Studio Code, ordenador</w:t>
+            </w:r>
             <w:r>
               <w:rPr>
                 <w:rtl w:val="0"/>
@@ -9360,16 +9514,24 @@
           <w:tcPr/>
           <w:p>
             <w:pPr>
-              <w:jc w:val="both"/>
               <w:rPr>
                 <w:rFonts w:ascii="Calibri" w:cs="Calibri" w:eastAsia="Calibri" w:hAnsi="Calibri"/>
                 <w:i w:val="1"/>
                 <w:iCs w:val="1"/>
-                <w:color w:val="548dd4"/>
-                <w:sz w:val="18"/>
-                <w:szCs w:val="18"/>
-              </w:rPr>
-            </w:pPr>
+                <w:sz w:val="18"/>
+                <w:szCs w:val="18"/>
+              </w:rPr>
+            </w:pPr>
+            <w:r>
+              <w:rPr>
+                <w:i w:val="1"/>
+                <w:iCs w:val="1"/>
+                <w:sz w:val="18"/>
+                <w:szCs w:val="18"/>
+                <w:rtl w:val="0"/>
+              </w:rPr>
+              <w:t xml:space="preserve">No tener definido cual es la mejor forma de exportar estos datos dificulta su desarrollo.</w:t>
+            </w:r>
             <w:r>
               <w:rPr>
                 <w:rtl w:val="0"/>
@@ -9528,16 +9690,24 @@
           <w:tcPr/>
           <w:p>
             <w:pPr>
-              <w:jc w:val="both"/>
               <w:rPr>
                 <w:rFonts w:ascii="Calibri" w:cs="Calibri" w:eastAsia="Calibri" w:hAnsi="Calibri"/>
                 <w:i w:val="1"/>
                 <w:iCs w:val="1"/>
-                <w:color w:val="548dd4"/>
-                <w:sz w:val="18"/>
-                <w:szCs w:val="18"/>
-              </w:rPr>
-            </w:pPr>
+                <w:sz w:val="18"/>
+                <w:szCs w:val="18"/>
+              </w:rPr>
+            </w:pPr>
+            <w:r>
+              <w:rPr>
+                <w:i w:val="1"/>
+                <w:iCs w:val="1"/>
+                <w:sz w:val="18"/>
+                <w:szCs w:val="18"/>
+                <w:rtl w:val="0"/>
+              </w:rPr>
+              <w:t xml:space="preserve">Android Studio, Visual Studio Code, ordenador</w:t>
+            </w:r>
             <w:r>
               <w:rPr>
                 <w:rtl w:val="0"/>
@@ -9613,16 +9783,24 @@
           <w:tcPr/>
           <w:p>
             <w:pPr>
-              <w:jc w:val="both"/>
               <w:rPr>
                 <w:rFonts w:ascii="Calibri" w:cs="Calibri" w:eastAsia="Calibri" w:hAnsi="Calibri"/>
                 <w:i w:val="1"/>
                 <w:iCs w:val="1"/>
-                <w:color w:val="548dd4"/>
-                <w:sz w:val="18"/>
-                <w:szCs w:val="18"/>
-              </w:rPr>
-            </w:pPr>
+                <w:sz w:val="18"/>
+                <w:szCs w:val="18"/>
+              </w:rPr>
+            </w:pPr>
+            <w:r>
+              <w:rPr>
+                <w:i w:val="1"/>
+                <w:iCs w:val="1"/>
+                <w:sz w:val="18"/>
+                <w:szCs w:val="18"/>
+                <w:rtl w:val="0"/>
+              </w:rPr>
+              <w:t xml:space="preserve">La poca experiencia con funcionalidades similares dificulta su desarrollo.</w:t>
+            </w:r>
             <w:r>
               <w:rPr>
                 <w:rtl w:val="0"/>
@@ -9774,16 +9952,24 @@
           <w:tcPr/>
           <w:p>
             <w:pPr>
-              <w:jc w:val="both"/>
               <w:rPr>
                 <w:rFonts w:ascii="Calibri" w:cs="Calibri" w:eastAsia="Calibri" w:hAnsi="Calibri"/>
                 <w:i w:val="1"/>
                 <w:iCs w:val="1"/>
-                <w:color w:val="548dd4"/>
-                <w:sz w:val="18"/>
-                <w:szCs w:val="18"/>
-              </w:rPr>
-            </w:pPr>
+                <w:sz w:val="18"/>
+                <w:szCs w:val="18"/>
+              </w:rPr>
+            </w:pPr>
+            <w:r>
+              <w:rPr>
+                <w:i w:val="1"/>
+                <w:iCs w:val="1"/>
+                <w:sz w:val="18"/>
+                <w:szCs w:val="18"/>
+                <w:rtl w:val="0"/>
+              </w:rPr>
+              <w:t xml:space="preserve">Android Studio, Visual Studio Code, ordenador</w:t>
+            </w:r>
             <w:r>
               <w:rPr>
                 <w:rtl w:val="0"/>
@@ -9859,16 +10045,24 @@
           <w:tcPr/>
           <w:p>
             <w:pPr>
-              <w:jc w:val="both"/>
               <w:rPr>
                 <w:rFonts w:ascii="Calibri" w:cs="Calibri" w:eastAsia="Calibri" w:hAnsi="Calibri"/>
                 <w:i w:val="1"/>
                 <w:iCs w:val="1"/>
-                <w:color w:val="548dd4"/>
-                <w:sz w:val="18"/>
-                <w:szCs w:val="18"/>
-              </w:rPr>
-            </w:pPr>
+                <w:sz w:val="18"/>
+                <w:szCs w:val="18"/>
+              </w:rPr>
+            </w:pPr>
+            <w:r>
+              <w:rPr>
+                <w:i w:val="1"/>
+                <w:iCs w:val="1"/>
+                <w:sz w:val="18"/>
+                <w:szCs w:val="18"/>
+                <w:rtl w:val="0"/>
+              </w:rPr>
+              <w:t xml:space="preserve">La experiencia con procesos CRUD ayuda al desarrollo.</w:t>
+            </w:r>
             <w:r>
               <w:rPr>
                 <w:rtl w:val="0"/>
@@ -10002,16 +10196,24 @@
           <w:tcPr/>
           <w:p>
             <w:pPr>
-              <w:jc w:val="both"/>
               <w:rPr>
                 <w:rFonts w:ascii="Calibri" w:cs="Calibri" w:eastAsia="Calibri" w:hAnsi="Calibri"/>
                 <w:i w:val="1"/>
                 <w:iCs w:val="1"/>
-                <w:color w:val="548dd4"/>
-                <w:sz w:val="18"/>
-                <w:szCs w:val="18"/>
-              </w:rPr>
-            </w:pPr>
+                <w:sz w:val="18"/>
+                <w:szCs w:val="18"/>
+              </w:rPr>
+            </w:pPr>
+            <w:r>
+              <w:rPr>
+                <w:i w:val="1"/>
+                <w:iCs w:val="1"/>
+                <w:sz w:val="18"/>
+                <w:szCs w:val="18"/>
+                <w:rtl w:val="0"/>
+              </w:rPr>
+              <w:t xml:space="preserve">Android Studio, Visual Studio Code, ordenador</w:t>
+            </w:r>
             <w:r>
               <w:rPr>
                 <w:rtl w:val="0"/>
@@ -10093,16 +10295,24 @@
           <w:tcPr/>
           <w:p>
             <w:pPr>
-              <w:jc w:val="both"/>
               <w:rPr>
                 <w:rFonts w:ascii="Calibri" w:cs="Calibri" w:eastAsia="Calibri" w:hAnsi="Calibri"/>
                 <w:i w:val="1"/>
                 <w:iCs w:val="1"/>
-                <w:color w:val="548dd4"/>
-                <w:sz w:val="18"/>
-                <w:szCs w:val="18"/>
-              </w:rPr>
-            </w:pPr>
+                <w:sz w:val="18"/>
+                <w:szCs w:val="18"/>
+              </w:rPr>
+            </w:pPr>
+            <w:r>
+              <w:rPr>
+                <w:i w:val="1"/>
+                <w:iCs w:val="1"/>
+                <w:sz w:val="18"/>
+                <w:szCs w:val="18"/>
+                <w:rtl w:val="0"/>
+              </w:rPr>
+              <w:t xml:space="preserve">La poca experiencia con funcionalidades similares dificulta su desarrollo.</w:t>
+            </w:r>
             <w:r>
               <w:rPr>
                 <w:rtl w:val="0"/>
@@ -10121,7 +10331,6 @@
             <w:tcBorders>
               <w:right w:color="bfbfbf" w:space="0" w:sz="6" w:val="single"/>
             </w:tcBorders>
-            <w:shd w:fill="f4cccc" w:val="clear"/>
           </w:tcPr>
           <w:p>
             <w:pPr>
@@ -10161,240 +10370,6 @@
               <w:spacing w:after="0" w:before="0" w:lineRule="auto"/>
               <w:rPr>
                 <w:rFonts w:ascii="Calibri" w:cs="Calibri" w:eastAsia="Calibri" w:hAnsi="Calibri"/>
-                <w:i w:val="1"/>
-                <w:iCs w:val="1"/>
-                <w:color w:val="548dd4"/>
-                <w:sz w:val="18"/>
-                <w:szCs w:val="18"/>
-              </w:rPr>
-            </w:pPr>
-            <w:r>
-              <w:rPr>
-                <w:color w:val="1a1a1a"/>
-                <w:sz w:val="20"/>
-                <w:szCs w:val="20"/>
-                <w:rtl w:val="0"/>
-              </w:rPr>
-              <w:t xml:space="preserve">Dispositivos móviles</w:t>
-            </w:r>
-            <w:r>
-              <w:rPr>
-                <w:rtl w:val="0"/>
-              </w:rPr>
-            </w:r>
-          </w:p>
-        </w:tc>
-        <w:tc>
-          <w:tcPr>
-            <w:tcBorders>
-              <w:top w:color="bfbfbf" w:space="0" w:sz="6" w:val="single"/>
-              <w:left w:color="bfbfbf" w:space="0" w:sz="6" w:val="single"/>
-              <w:bottom w:color="bfbfbf" w:space="0" w:sz="6" w:val="single"/>
-              <w:right w:color="bfbfbf" w:space="0" w:sz="6" w:val="single"/>
-            </w:tcBorders>
-            <w:shd w:fill="f4cccc" w:val="clear"/>
-            <w:tcMar>
-              <w:top w:w="0.0" w:type="dxa"/>
-              <w:left w:w="40.0" w:type="dxa"/>
-              <w:bottom w:w="0.0" w:type="dxa"/>
-              <w:right w:w="40.0" w:type="dxa"/>
-            </w:tcMar>
-            <w:vAlign w:val="top"/>
-          </w:tcPr>
-          <w:p>
-            <w:pPr>
-              <w:rPr>
-                <w:i w:val="1"/>
-                <w:iCs w:val="1"/>
-                <w:sz w:val="20"/>
-                <w:szCs w:val="20"/>
-              </w:rPr>
-            </w:pPr>
-            <w:r>
-              <w:rPr>
-                <w:i w:val="1"/>
-                <w:iCs w:val="1"/>
-                <w:sz w:val="20"/>
-                <w:szCs w:val="20"/>
-                <w:rtl w:val="0"/>
-              </w:rPr>
-              <w:t xml:space="preserve">Actividades compartidas con otras personas</w:t>
-            </w:r>
-            <w:r>
-              <w:rPr>
-                <w:rtl w:val="0"/>
-              </w:rPr>
-            </w:r>
-          </w:p>
-        </w:tc>
-        <w:tc>
-          <w:tcPr>
-            <w:tcBorders>
-              <w:left w:color="bfbfbf" w:space="0" w:sz="6" w:val="single"/>
-            </w:tcBorders>
-            <w:shd w:fill="f4cccc" w:val="clear"/>
-          </w:tcPr>
-          <w:p>
-            <w:pPr>
-              <w:rPr>
-                <w:rFonts w:ascii="Calibri" w:cs="Calibri" w:eastAsia="Calibri" w:hAnsi="Calibri"/>
-                <w:i w:val="1"/>
-                <w:iCs w:val="1"/>
-                <w:sz w:val="20"/>
-                <w:szCs w:val="20"/>
-              </w:rPr>
-            </w:pPr>
-            <w:r>
-              <w:rPr>
-                <w:i w:val="1"/>
-                <w:iCs w:val="1"/>
-                <w:sz w:val="20"/>
-                <w:szCs w:val="20"/>
-                <w:rtl w:val="0"/>
-              </w:rPr>
-              <w:t xml:space="preserve">Función para clonar una actividad, compartiendola con otro usuario.</w:t>
-            </w:r>
-            <w:r>
-              <w:rPr>
-                <w:rtl w:val="0"/>
-              </w:rPr>
-            </w:r>
-          </w:p>
-        </w:tc>
-        <w:tc>
-          <w:tcPr>
-            <w:shd w:fill="f4cccc" w:val="clear"/>
-          </w:tcPr>
-          <w:p>
-            <w:pPr>
-              <w:jc w:val="both"/>
-              <w:rPr>
-                <w:rFonts w:ascii="Calibri" w:cs="Calibri" w:eastAsia="Calibri" w:hAnsi="Calibri"/>
-                <w:i w:val="1"/>
-                <w:iCs w:val="1"/>
-                <w:color w:val="548dd4"/>
-                <w:sz w:val="18"/>
-                <w:szCs w:val="18"/>
-              </w:rPr>
-            </w:pPr>
-            <w:r>
-              <w:rPr>
-                <w:rtl w:val="0"/>
-              </w:rPr>
-            </w:r>
-          </w:p>
-        </w:tc>
-        <w:tc>
-          <w:tcPr>
-            <w:tcBorders>
-              <w:right w:color="ffffff" w:space="0" w:sz="4" w:val="single"/>
-            </w:tcBorders>
-            <w:shd w:fill="f4cccc" w:val="clear"/>
-          </w:tcPr>
-          <w:p>
-            <w:pPr>
-              <w:jc w:val="both"/>
-              <w:rPr>
-                <w:rFonts w:ascii="Calibri" w:cs="Calibri" w:eastAsia="Calibri" w:hAnsi="Calibri"/>
-                <w:i w:val="1"/>
-                <w:iCs w:val="1"/>
-                <w:color w:val="548dd4"/>
-                <w:sz w:val="18"/>
-                <w:szCs w:val="18"/>
-              </w:rPr>
-            </w:pPr>
-            <w:r>
-              <w:rPr>
-                <w:i w:val="1"/>
-                <w:iCs w:val="1"/>
-                <w:sz w:val="18"/>
-                <w:szCs w:val="18"/>
-                <w:rtl w:val="0"/>
-              </w:rPr>
-              <w:t xml:space="preserve">13-09-26 hasta 15-09-26</w:t>
-            </w:r>
-            <w:r>
-              <w:rPr>
-                <w:rtl w:val="0"/>
-              </w:rPr>
-            </w:r>
-          </w:p>
-        </w:tc>
-        <w:tc>
-          <w:tcPr>
-            <w:tcBorders>
-              <w:left w:color="ffffff" w:space="0" w:sz="4" w:val="single"/>
-            </w:tcBorders>
-            <w:shd w:fill="f4cccc" w:val="clear"/>
-          </w:tcPr>
-          <w:p>
-            <w:pPr>
-              <w:jc w:val="both"/>
-              <w:rPr>
-                <w:i w:val="1"/>
-                <w:iCs w:val="1"/>
-                <w:sz w:val="18"/>
-                <w:szCs w:val="18"/>
-              </w:rPr>
-            </w:pPr>
-            <w:r>
-              <w:rPr>
-                <w:i w:val="1"/>
-                <w:iCs w:val="1"/>
-                <w:sz w:val="18"/>
-                <w:szCs w:val="18"/>
-                <w:rtl w:val="0"/>
-              </w:rPr>
-              <w:t xml:space="preserve">Thalia y Vicente</w:t>
-            </w:r>
-          </w:p>
-        </w:tc>
-        <w:tc>
-          <w:tcPr>
-            <w:shd w:fill="f4cccc" w:val="clear"/>
-          </w:tcPr>
-          <w:p>
-            <w:pPr>
-              <w:jc w:val="both"/>
-              <w:rPr>
-                <w:rFonts w:ascii="Calibri" w:cs="Calibri" w:eastAsia="Calibri" w:hAnsi="Calibri"/>
-                <w:i w:val="1"/>
-                <w:iCs w:val="1"/>
-                <w:color w:val="548dd4"/>
-                <w:sz w:val="18"/>
-                <w:szCs w:val="18"/>
-              </w:rPr>
-            </w:pPr>
-            <w:r>
-              <w:rPr>
-                <w:rtl w:val="0"/>
-              </w:rPr>
-            </w:r>
-          </w:p>
-        </w:tc>
-      </w:tr>
-      <w:tr>
-        <w:trPr>
-          <w:cantSplit w:val="0"/>
-          <w:tblHeader w:val="0"/>
-        </w:trPr>
-        <w:tc>
-          <w:tcPr>
-            <w:tcBorders>
-              <w:right w:color="bfbfbf" w:space="0" w:sz="6" w:val="single"/>
-            </w:tcBorders>
-          </w:tcPr>
-          <w:p>
-            <w:pPr>
-              <w:pBdr>
-                <w:top w:color="auto" w:space="7" w:sz="0" w:val="none"/>
-                <w:bottom w:color="auto" w:space="7" w:sz="0" w:val="none"/>
-                <w:right w:color="auto" w:space="7" w:sz="0" w:val="none"/>
-                <w:between w:color="auto" w:space="7" w:sz="0" w:val="none"/>
-              </w:pBdr>
-              <w:shd w:fill="ffffff" w:val="clear"/>
-              <w:spacing w:after="0" w:before="0" w:lineRule="auto"/>
-              <w:rPr>
                 <w:i w:val="1"/>
                 <w:iCs w:val="1"/>
                 <w:color w:val="548dd4"/>
@@ -10451,7 +10426,7 @@
                 <w:szCs w:val="20"/>
                 <w:rtl w:val="0"/>
               </w:rPr>
-              <w:t xml:space="preserve">Personalización de mascota (colores y fondo)</w:t>
+              <w:t xml:space="preserve">Actividades compartidas con otras personas</w:t>
             </w:r>
             <w:r>
               <w:rPr>
@@ -10484,29 +10459,37 @@
                 <w:szCs w:val="20"/>
                 <w:rtl w:val="0"/>
               </w:rPr>
-              <w:t xml:space="preserve">Opción de personalización a preferencia del usuario.</w:t>
-            </w:r>
-            <w:r>
-              <w:rPr>
-                <w:rtl w:val="0"/>
-              </w:rPr>
-            </w:r>
-          </w:p>
-        </w:tc>
-        <w:tc>
-          <w:tcPr/>
-          <w:p>
-            <w:pPr>
-              <w:jc w:val="both"/>
+              <w:t xml:space="preserve">Función para clonar una actividad, compartiendola con otro usuario.</w:t>
+            </w:r>
+            <w:r>
+              <w:rPr>
+                <w:rtl w:val="0"/>
+              </w:rPr>
+            </w:r>
+          </w:p>
+        </w:tc>
+        <w:tc>
+          <w:tcPr/>
+          <w:p>
+            <w:pPr>
               <w:rPr>
                 <w:rFonts w:ascii="Calibri" w:cs="Calibri" w:eastAsia="Calibri" w:hAnsi="Calibri"/>
                 <w:i w:val="1"/>
                 <w:iCs w:val="1"/>
-                <w:color w:val="548dd4"/>
-                <w:sz w:val="18"/>
-                <w:szCs w:val="18"/>
-              </w:rPr>
-            </w:pPr>
+                <w:sz w:val="18"/>
+                <w:szCs w:val="18"/>
+              </w:rPr>
+            </w:pPr>
+            <w:r>
+              <w:rPr>
+                <w:i w:val="1"/>
+                <w:iCs w:val="1"/>
+                <w:sz w:val="18"/>
+                <w:szCs w:val="18"/>
+                <w:rtl w:val="0"/>
+              </w:rPr>
+              <w:t xml:space="preserve">Android Studio, Visual Studio Code, ordenador</w:t>
+            </w:r>
             <w:r>
               <w:rPr>
                 <w:rtl w:val="0"/>
@@ -10540,7 +10523,7 @@
                 <w:szCs w:val="18"/>
                 <w:rtl w:val="0"/>
               </w:rPr>
-              <w:t xml:space="preserve">15-09-26 hasta 21-09-26</w:t>
+              <w:t xml:space="preserve">13-09-26 hasta 15-09-26</w:t>
             </w:r>
             <w:r>
               <w:rPr>
@@ -10582,20 +10565,22 @@
           <w:tcPr/>
           <w:p>
             <w:pPr>
-              <w:jc w:val="both"/>
-              <w:rPr>
-                <w:rFonts w:ascii="Calibri" w:cs="Calibri" w:eastAsia="Calibri" w:hAnsi="Calibri"/>
-                <w:i w:val="1"/>
-                <w:iCs w:val="1"/>
-                <w:color w:val="548dd4"/>
-                <w:sz w:val="18"/>
-                <w:szCs w:val="18"/>
-              </w:rPr>
-            </w:pPr>
-            <w:r>
-              <w:rPr>
-                <w:rtl w:val="0"/>
-              </w:rPr>
+              <w:rPr>
+                <w:i w:val="1"/>
+                <w:iCs w:val="1"/>
+                <w:sz w:val="18"/>
+                <w:szCs w:val="18"/>
+              </w:rPr>
+            </w:pPr>
+            <w:r>
+              <w:rPr>
+                <w:i w:val="1"/>
+                <w:iCs w:val="1"/>
+                <w:sz w:val="18"/>
+                <w:szCs w:val="18"/>
+                <w:rtl w:val="0"/>
+              </w:rPr>
+              <w:t xml:space="preserve">La poca experiencia con funcionalidades similares dificulta su desarrollo.</w:t>
             </w:r>
           </w:p>
         </w:tc>
@@ -10678,7 +10663,7 @@
                 <w:szCs w:val="20"/>
                 <w:rtl w:val="0"/>
               </w:rPr>
-              <w:t xml:space="preserve">Desbloqueo de nuevos elementos de personalización</w:t>
+              <w:t xml:space="preserve">Personalización de mascota (colores y fondo)</w:t>
             </w:r>
             <w:r>
               <w:rPr>
@@ -10711,29 +10696,37 @@
                 <w:szCs w:val="20"/>
                 <w:rtl w:val="0"/>
               </w:rPr>
-              <w:t xml:space="preserve">Sistema de premiación al usuario por utilizar la aplicación, desbloqueando nuevas funciones.</w:t>
-            </w:r>
-            <w:r>
-              <w:rPr>
-                <w:rtl w:val="0"/>
-              </w:rPr>
-            </w:r>
-          </w:p>
-        </w:tc>
-        <w:tc>
-          <w:tcPr/>
-          <w:p>
-            <w:pPr>
-              <w:jc w:val="both"/>
+              <w:t xml:space="preserve">Opción de personalización a preferencia del usuario.</w:t>
+            </w:r>
+            <w:r>
+              <w:rPr>
+                <w:rtl w:val="0"/>
+              </w:rPr>
+            </w:r>
+          </w:p>
+        </w:tc>
+        <w:tc>
+          <w:tcPr/>
+          <w:p>
+            <w:pPr>
               <w:rPr>
                 <w:rFonts w:ascii="Calibri" w:cs="Calibri" w:eastAsia="Calibri" w:hAnsi="Calibri"/>
                 <w:i w:val="1"/>
                 <w:iCs w:val="1"/>
-                <w:color w:val="548dd4"/>
-                <w:sz w:val="18"/>
-                <w:szCs w:val="18"/>
-              </w:rPr>
-            </w:pPr>
+                <w:sz w:val="18"/>
+                <w:szCs w:val="18"/>
+              </w:rPr>
+            </w:pPr>
+            <w:r>
+              <w:rPr>
+                <w:i w:val="1"/>
+                <w:iCs w:val="1"/>
+                <w:sz w:val="18"/>
+                <w:szCs w:val="18"/>
+                <w:rtl w:val="0"/>
+              </w:rPr>
+              <w:t xml:space="preserve">Android Studio, Visual Studio Code, ordenador</w:t>
+            </w:r>
             <w:r>
               <w:rPr>
                 <w:rtl w:val="0"/>
@@ -10767,7 +10760,7 @@
                 <w:szCs w:val="18"/>
                 <w:rtl w:val="0"/>
               </w:rPr>
-              <w:t xml:space="preserve">21-09-26 hasta 22-09-26</w:t>
+              <w:t xml:space="preserve">15-09-26 hasta 21-09-26</w:t>
             </w:r>
             <w:r>
               <w:rPr>
@@ -10809,20 +10802,22 @@
           <w:tcPr/>
           <w:p>
             <w:pPr>
-              <w:jc w:val="both"/>
-              <w:rPr>
-                <w:rFonts w:ascii="Calibri" w:cs="Calibri" w:eastAsia="Calibri" w:hAnsi="Calibri"/>
-                <w:i w:val="1"/>
-                <w:iCs w:val="1"/>
-                <w:color w:val="548dd4"/>
-                <w:sz w:val="18"/>
-                <w:szCs w:val="18"/>
-              </w:rPr>
-            </w:pPr>
-            <w:r>
-              <w:rPr>
-                <w:rtl w:val="0"/>
-              </w:rPr>
+              <w:rPr>
+                <w:i w:val="1"/>
+                <w:iCs w:val="1"/>
+                <w:sz w:val="18"/>
+                <w:szCs w:val="18"/>
+              </w:rPr>
+            </w:pPr>
+            <w:r>
+              <w:rPr>
+                <w:i w:val="1"/>
+                <w:iCs w:val="1"/>
+                <w:sz w:val="18"/>
+                <w:szCs w:val="18"/>
+                <w:rtl w:val="0"/>
+              </w:rPr>
+              <w:t xml:space="preserve">La poca experiencia con funcionalidades similares dificulta su desarrollo.</w:t>
             </w:r>
           </w:p>
         </w:tc>
@@ -10905,7 +10900,7 @@
                 <w:szCs w:val="20"/>
                 <w:rtl w:val="0"/>
               </w:rPr>
-              <w:t xml:space="preserve">Animaciones de la mascota según actividades realizadas</w:t>
+              <w:t xml:space="preserve">Desbloqueo de nuevos elementos de personalización</w:t>
             </w:r>
             <w:r>
               <w:rPr>
@@ -10938,29 +10933,37 @@
                 <w:szCs w:val="20"/>
                 <w:rtl w:val="0"/>
               </w:rPr>
-              <w:t xml:space="preserve">Sistema de estado de la mascota, registrando un puntaje que se reflejara en el animo de la mascota.</w:t>
-            </w:r>
-            <w:r>
-              <w:rPr>
-                <w:rtl w:val="0"/>
-              </w:rPr>
-            </w:r>
-          </w:p>
-        </w:tc>
-        <w:tc>
-          <w:tcPr/>
-          <w:p>
-            <w:pPr>
-              <w:jc w:val="both"/>
+              <w:t xml:space="preserve">Sistema de premiación al usuario por utilizar la aplicación, desbloqueando nuevas funciones.</w:t>
+            </w:r>
+            <w:r>
+              <w:rPr>
+                <w:rtl w:val="0"/>
+              </w:rPr>
+            </w:r>
+          </w:p>
+        </w:tc>
+        <w:tc>
+          <w:tcPr/>
+          <w:p>
+            <w:pPr>
               <w:rPr>
                 <w:rFonts w:ascii="Calibri" w:cs="Calibri" w:eastAsia="Calibri" w:hAnsi="Calibri"/>
                 <w:i w:val="1"/>
                 <w:iCs w:val="1"/>
-                <w:color w:val="548dd4"/>
-                <w:sz w:val="18"/>
-                <w:szCs w:val="18"/>
-              </w:rPr>
-            </w:pPr>
+                <w:sz w:val="18"/>
+                <w:szCs w:val="18"/>
+              </w:rPr>
+            </w:pPr>
+            <w:r>
+              <w:rPr>
+                <w:i w:val="1"/>
+                <w:iCs w:val="1"/>
+                <w:sz w:val="18"/>
+                <w:szCs w:val="18"/>
+                <w:rtl w:val="0"/>
+              </w:rPr>
+              <w:t xml:space="preserve">Android Studio, Visual Studio Code, ordenador</w:t>
+            </w:r>
             <w:r>
               <w:rPr>
                 <w:rtl w:val="0"/>
@@ -10994,7 +10997,7 @@
                 <w:szCs w:val="18"/>
                 <w:rtl w:val="0"/>
               </w:rPr>
-              <w:t xml:space="preserve">22-09-26 hasta 25-09-26</w:t>
+              <w:t xml:space="preserve">21-09-26 hasta 22-09-26</w:t>
             </w:r>
             <w:r>
               <w:rPr>
@@ -11036,16 +11039,24 @@
           <w:tcPr/>
           <w:p>
             <w:pPr>
-              <w:jc w:val="both"/>
               <w:rPr>
                 <w:rFonts w:ascii="Calibri" w:cs="Calibri" w:eastAsia="Calibri" w:hAnsi="Calibri"/>
                 <w:i w:val="1"/>
                 <w:iCs w:val="1"/>
-                <w:color w:val="548dd4"/>
-                <w:sz w:val="18"/>
-                <w:szCs w:val="18"/>
-              </w:rPr>
-            </w:pPr>
+                <w:sz w:val="18"/>
+                <w:szCs w:val="18"/>
+              </w:rPr>
+            </w:pPr>
+            <w:r>
+              <w:rPr>
+                <w:i w:val="1"/>
+                <w:iCs w:val="1"/>
+                <w:sz w:val="18"/>
+                <w:szCs w:val="18"/>
+                <w:rtl w:val="0"/>
+              </w:rPr>
+              <w:t xml:space="preserve">La lógica de desbloqueo y los desbloqueables no están definidos, lo que dificulta el desarrollo.</w:t>
+            </w:r>
             <w:r>
               <w:rPr>
                 <w:rtl w:val="0"/>
@@ -11076,66 +11087,22 @@
               <w:shd w:fill="ffffff" w:val="clear"/>
               <w:spacing w:after="0" w:before="0" w:lineRule="auto"/>
               <w:rPr>
+                <w:i w:val="1"/>
+                <w:iCs w:val="1"/>
+                <w:color w:val="548dd4"/>
+                <w:sz w:val="18"/>
+                <w:szCs w:val="18"/>
+              </w:rPr>
+            </w:pPr>
+            <w:r>
+              <w:rPr>
                 <w:color w:val="1a1a1a"/>
                 <w:sz w:val="20"/>
                 <w:szCs w:val="20"/>
-              </w:rPr>
-            </w:pPr>
-            <w:r>
-              <w:rPr>
-                <w:color w:val="1a1a1a"/>
-                <w:sz w:val="20"/>
-                <w:szCs w:val="20"/>
-                <w:rtl w:val="0"/>
-              </w:rPr>
-              <w:t xml:space="preserve">Bases de datos</w:t>
-            </w:r>
-          </w:p>
-          <w:p>
-            <w:pPr>
-              <w:pBdr>
-                <w:top w:color="auto" w:space="7" w:sz="0" w:val="none"/>
-                <w:bottom w:color="auto" w:space="7" w:sz="0" w:val="none"/>
-                <w:right w:color="auto" w:space="7" w:sz="0" w:val="none"/>
-                <w:between w:color="auto" w:space="7" w:sz="0" w:val="none"/>
-              </w:pBdr>
-              <w:shd w:fill="ffffff" w:val="clear"/>
-              <w:spacing w:after="0" w:before="0" w:lineRule="auto"/>
-              <w:rPr>
-                <w:i w:val="1"/>
-                <w:iCs w:val="1"/>
-                <w:color w:val="548dd4"/>
-                <w:sz w:val="18"/>
-                <w:szCs w:val="18"/>
-              </w:rPr>
-            </w:pPr>
-            <w:r>
-              <w:rPr>
-                <w:color w:val="1a1a1a"/>
-                <w:sz w:val="20"/>
-                <w:szCs w:val="20"/>
                 <w:rtl w:val="0"/>
               </w:rPr>
               <w:t xml:space="preserve">Dispositivos móviles</w:t>
             </w:r>
-            <w:r>
-              <w:rPr>
-                <w:rtl w:val="0"/>
-              </w:rPr>
-            </w:r>
-          </w:p>
-          <w:p>
-            <w:pPr>
-              <w:spacing w:before="0" w:lineRule="auto"/>
-              <w:jc w:val="both"/>
-              <w:rPr>
-                <w:i w:val="1"/>
-                <w:iCs w:val="1"/>
-                <w:color w:val="548dd4"/>
-                <w:sz w:val="18"/>
-                <w:szCs w:val="18"/>
-              </w:rPr>
-            </w:pPr>
             <w:r>
               <w:rPr>
                 <w:rtl w:val="0"/>
@@ -11176,7 +11143,7 @@
                 <w:szCs w:val="20"/>
                 <w:rtl w:val="0"/>
               </w:rPr>
-              <w:t xml:space="preserve">Gestión y mantenimiento de rachas personales</w:t>
+              <w:t xml:space="preserve">Animaciones de la mascota según actividades realizadas</w:t>
             </w:r>
             <w:r>
               <w:rPr>
@@ -11209,29 +11176,37 @@
                 <w:szCs w:val="20"/>
                 <w:rtl w:val="0"/>
               </w:rPr>
-              <w:t xml:space="preserve">Vista de objetivos activos e históricos para seguimiento por el usuario.</w:t>
-            </w:r>
-            <w:r>
-              <w:rPr>
-                <w:rtl w:val="0"/>
-              </w:rPr>
-            </w:r>
-          </w:p>
-        </w:tc>
-        <w:tc>
-          <w:tcPr/>
-          <w:p>
-            <w:pPr>
-              <w:jc w:val="both"/>
+              <w:t xml:space="preserve">Sistema de estado de la mascota, registrando un puntaje que se reflejara en el animo de la mascota.</w:t>
+            </w:r>
+            <w:r>
+              <w:rPr>
+                <w:rtl w:val="0"/>
+              </w:rPr>
+            </w:r>
+          </w:p>
+        </w:tc>
+        <w:tc>
+          <w:tcPr/>
+          <w:p>
+            <w:pPr>
               <w:rPr>
                 <w:rFonts w:ascii="Calibri" w:cs="Calibri" w:eastAsia="Calibri" w:hAnsi="Calibri"/>
                 <w:i w:val="1"/>
                 <w:iCs w:val="1"/>
-                <w:color w:val="548dd4"/>
-                <w:sz w:val="18"/>
-                <w:szCs w:val="18"/>
-              </w:rPr>
-            </w:pPr>
+                <w:sz w:val="18"/>
+                <w:szCs w:val="18"/>
+              </w:rPr>
+            </w:pPr>
+            <w:r>
+              <w:rPr>
+                <w:i w:val="1"/>
+                <w:iCs w:val="1"/>
+                <w:sz w:val="18"/>
+                <w:szCs w:val="18"/>
+                <w:rtl w:val="0"/>
+              </w:rPr>
+              <w:t xml:space="preserve">Android Studio, Visual Studio Code, Lottie, ordenador</w:t>
+            </w:r>
             <w:r>
               <w:rPr>
                 <w:rtl w:val="0"/>
@@ -11265,7 +11240,7 @@
                 <w:szCs w:val="18"/>
                 <w:rtl w:val="0"/>
               </w:rPr>
-              <w:t xml:space="preserve">27-09-26 hasta 30-09-26</w:t>
+              <w:t xml:space="preserve">22-09-26 hasta 25-09-26</w:t>
             </w:r>
             <w:r>
               <w:rPr>
@@ -11285,6 +11260,29 @@
             <w:pPr>
               <w:jc w:val="both"/>
               <w:rPr>
+                <w:i w:val="1"/>
+                <w:iCs w:val="1"/>
+                <w:sz w:val="18"/>
+                <w:szCs w:val="18"/>
+              </w:rPr>
+            </w:pPr>
+            <w:r>
+              <w:rPr>
+                <w:i w:val="1"/>
+                <w:iCs w:val="1"/>
+                <w:sz w:val="18"/>
+                <w:szCs w:val="18"/>
+                <w:rtl w:val="0"/>
+              </w:rPr>
+              <w:t xml:space="preserve">Thalia y Vicente</w:t>
+            </w:r>
+          </w:p>
+        </w:tc>
+        <w:tc>
+          <w:tcPr/>
+          <w:p>
+            <w:pPr>
+              <w:rPr>
                 <w:rFonts w:ascii="Calibri" w:cs="Calibri" w:eastAsia="Calibri" w:hAnsi="Calibri"/>
                 <w:i w:val="1"/>
                 <w:iCs w:val="1"/>
@@ -11300,29 +11298,8 @@
                 <w:szCs w:val="18"/>
                 <w:rtl w:val="0"/>
               </w:rPr>
-              <w:t xml:space="preserve">Vicente</w:t>
-            </w:r>
-            <w:r>
-              <w:rPr>
-                <w:rtl w:val="0"/>
-              </w:rPr>
-            </w:r>
-          </w:p>
-        </w:tc>
-        <w:tc>
-          <w:tcPr/>
-          <w:p>
-            <w:pPr>
-              <w:jc w:val="both"/>
-              <w:rPr>
-                <w:rFonts w:ascii="Calibri" w:cs="Calibri" w:eastAsia="Calibri" w:hAnsi="Calibri"/>
-                <w:i w:val="1"/>
-                <w:iCs w:val="1"/>
-                <w:color w:val="548dd4"/>
-                <w:sz w:val="18"/>
-                <w:szCs w:val="18"/>
-              </w:rPr>
-            </w:pPr>
+              <w:t xml:space="preserve">El tiempo de aprendizaje de Lottie dificulta el diseño de las mascotas.</w:t>
+            </w:r>
             <w:r>
               <w:rPr>
                 <w:rtl w:val="0"/>
@@ -11395,6 +11372,24 @@
               </w:rPr>
               <w:t xml:space="preserve">Dispositivos móviles</w:t>
             </w:r>
+            <w:r>
+              <w:rPr>
+                <w:rtl w:val="0"/>
+              </w:rPr>
+            </w:r>
+          </w:p>
+          <w:p>
+            <w:pPr>
+              <w:spacing w:before="0" w:lineRule="auto"/>
+              <w:jc w:val="both"/>
+              <w:rPr>
+                <w:i w:val="1"/>
+                <w:iCs w:val="1"/>
+                <w:color w:val="548dd4"/>
+                <w:sz w:val="18"/>
+                <w:szCs w:val="18"/>
+              </w:rPr>
+            </w:pPr>
             <w:r>
               <w:rPr>
                 <w:rtl w:val="0"/>
@@ -11435,7 +11430,7 @@
                 <w:szCs w:val="20"/>
                 <w:rtl w:val="0"/>
               </w:rPr>
-              <w:t xml:space="preserve">Creación y unión a actividades compartidas</w:t>
+              <w:t xml:space="preserve">Gestión y mantenimiento de rachas personales</w:t>
             </w:r>
             <w:r>
               <w:rPr>
@@ -11468,29 +11463,37 @@
                 <w:szCs w:val="20"/>
                 <w:rtl w:val="0"/>
               </w:rPr>
-              <w:t xml:space="preserve">Función que permite realizar actividades con otros usuarios.</w:t>
-            </w:r>
-            <w:r>
-              <w:rPr>
-                <w:rtl w:val="0"/>
-              </w:rPr>
-            </w:r>
-          </w:p>
-        </w:tc>
-        <w:tc>
-          <w:tcPr/>
-          <w:p>
-            <w:pPr>
-              <w:jc w:val="both"/>
+              <w:t xml:space="preserve">Vista de objetivos activos e históricos para seguimiento por el usuario.</w:t>
+            </w:r>
+            <w:r>
+              <w:rPr>
+                <w:rtl w:val="0"/>
+              </w:rPr>
+            </w:r>
+          </w:p>
+        </w:tc>
+        <w:tc>
+          <w:tcPr/>
+          <w:p>
+            <w:pPr>
               <w:rPr>
                 <w:rFonts w:ascii="Calibri" w:cs="Calibri" w:eastAsia="Calibri" w:hAnsi="Calibri"/>
                 <w:i w:val="1"/>
                 <w:iCs w:val="1"/>
-                <w:color w:val="548dd4"/>
-                <w:sz w:val="18"/>
-                <w:szCs w:val="18"/>
-              </w:rPr>
-            </w:pPr>
+                <w:sz w:val="18"/>
+                <w:szCs w:val="18"/>
+              </w:rPr>
+            </w:pPr>
+            <w:r>
+              <w:rPr>
+                <w:i w:val="1"/>
+                <w:iCs w:val="1"/>
+                <w:sz w:val="18"/>
+                <w:szCs w:val="18"/>
+                <w:rtl w:val="0"/>
+              </w:rPr>
+              <w:t xml:space="preserve">Android Studio, Visual Studio Code, ordenador</w:t>
+            </w:r>
             <w:r>
               <w:rPr>
                 <w:rtl w:val="0"/>
@@ -11524,7 +11527,7 @@
                 <w:szCs w:val="18"/>
                 <w:rtl w:val="0"/>
               </w:rPr>
-              <w:t xml:space="preserve">30-09-26 hasta 05-10-26</w:t>
+              <w:t xml:space="preserve">27-09-26 hasta 30-09-26</w:t>
             </w:r>
             <w:r>
               <w:rPr>
@@ -11544,38 +11547,52 @@
             <w:pPr>
               <w:jc w:val="both"/>
               <w:rPr>
-                <w:i w:val="1"/>
-                <w:iCs w:val="1"/>
-                <w:sz w:val="18"/>
-                <w:szCs w:val="18"/>
-              </w:rPr>
-            </w:pPr>
-            <w:r>
-              <w:rPr>
-                <w:i w:val="1"/>
-                <w:iCs w:val="1"/>
-                <w:sz w:val="18"/>
-                <w:szCs w:val="18"/>
-                <w:rtl w:val="0"/>
-              </w:rPr>
-              <w:t xml:space="preserve">Thalia y Vicente</w:t>
-            </w:r>
-          </w:p>
-        </w:tc>
-        <w:tc>
-          <w:tcPr/>
-          <w:p>
-            <w:pPr>
-              <w:jc w:val="both"/>
-              <w:rPr>
                 <w:rFonts w:ascii="Calibri" w:cs="Calibri" w:eastAsia="Calibri" w:hAnsi="Calibri"/>
                 <w:i w:val="1"/>
                 <w:iCs w:val="1"/>
-                <w:color w:val="548dd4"/>
-                <w:sz w:val="18"/>
-                <w:szCs w:val="18"/>
-              </w:rPr>
-            </w:pPr>
+                <w:sz w:val="18"/>
+                <w:szCs w:val="18"/>
+              </w:rPr>
+            </w:pPr>
+            <w:r>
+              <w:rPr>
+                <w:i w:val="1"/>
+                <w:iCs w:val="1"/>
+                <w:sz w:val="18"/>
+                <w:szCs w:val="18"/>
+                <w:rtl w:val="0"/>
+              </w:rPr>
+              <w:t xml:space="preserve">Vicente</w:t>
+            </w:r>
+            <w:r>
+              <w:rPr>
+                <w:rtl w:val="0"/>
+              </w:rPr>
+            </w:r>
+          </w:p>
+        </w:tc>
+        <w:tc>
+          <w:tcPr/>
+          <w:p>
+            <w:pPr>
+              <w:rPr>
+                <w:rFonts w:ascii="Calibri" w:cs="Calibri" w:eastAsia="Calibri" w:hAnsi="Calibri"/>
+                <w:i w:val="1"/>
+                <w:iCs w:val="1"/>
+                <w:sz w:val="18"/>
+                <w:szCs w:val="18"/>
+              </w:rPr>
+            </w:pPr>
+            <w:r>
+              <w:rPr>
+                <w:i w:val="1"/>
+                <w:iCs w:val="1"/>
+                <w:sz w:val="18"/>
+                <w:szCs w:val="18"/>
+                <w:rtl w:val="0"/>
+              </w:rPr>
+              <w:t xml:space="preserve">Se debe definir un sistema de puntajes, para gestionar el estado de las mascotas.</w:t>
+            </w:r>
             <w:r>
               <w:rPr>
                 <w:rtl w:val="0"/>
@@ -11594,7 +11611,6 @@
             <w:tcBorders>
               <w:right w:color="bfbfbf" w:space="0" w:sz="6" w:val="single"/>
             </w:tcBorders>
-            <w:shd w:fill="f4cccc" w:val="clear"/>
           </w:tcPr>
           <w:p>
             <w:pPr>
@@ -11633,267 +11649,6 @@
               <w:shd w:fill="ffffff" w:val="clear"/>
               <w:spacing w:after="0" w:before="0" w:lineRule="auto"/>
               <w:rPr>
-                <w:i w:val="1"/>
-                <w:iCs w:val="1"/>
-                <w:color w:val="548dd4"/>
-                <w:sz w:val="18"/>
-                <w:szCs w:val="18"/>
-              </w:rPr>
-            </w:pPr>
-            <w:r>
-              <w:rPr>
-                <w:color w:val="1a1a1a"/>
-                <w:sz w:val="20"/>
-                <w:szCs w:val="20"/>
-                <w:rtl w:val="0"/>
-              </w:rPr>
-              <w:t xml:space="preserve">Dispositivos móviles</w:t>
-            </w:r>
-            <w:r>
-              <w:rPr>
-                <w:rtl w:val="0"/>
-              </w:rPr>
-            </w:r>
-          </w:p>
-        </w:tc>
-        <w:tc>
-          <w:tcPr>
-            <w:tcBorders>
-              <w:top w:color="bfbfbf" w:space="0" w:sz="6" w:val="single"/>
-              <w:left w:color="bfbfbf" w:space="0" w:sz="6" w:val="single"/>
-              <w:bottom w:color="bfbfbf" w:space="0" w:sz="6" w:val="single"/>
-              <w:right w:color="bfbfbf" w:space="0" w:sz="6" w:val="single"/>
-            </w:tcBorders>
-            <w:shd w:fill="f4cccc" w:val="clear"/>
-            <w:tcMar>
-              <w:top w:w="0.0" w:type="dxa"/>
-              <w:left w:w="40.0" w:type="dxa"/>
-              <w:bottom w:w="0.0" w:type="dxa"/>
-              <w:right w:w="40.0" w:type="dxa"/>
-            </w:tcMar>
-            <w:vAlign w:val="top"/>
-          </w:tcPr>
-          <w:p>
-            <w:pPr>
-              <w:rPr>
-                <w:i w:val="1"/>
-                <w:iCs w:val="1"/>
-                <w:sz w:val="20"/>
-                <w:szCs w:val="20"/>
-              </w:rPr>
-            </w:pPr>
-            <w:r>
-              <w:rPr>
-                <w:i w:val="1"/>
-                <w:iCs w:val="1"/>
-                <w:sz w:val="20"/>
-                <w:szCs w:val="20"/>
-                <w:rtl w:val="0"/>
-              </w:rPr>
-              <w:t xml:space="preserve">Compartir rachas con contactos</w:t>
-            </w:r>
-            <w:r>
-              <w:rPr>
-                <w:rtl w:val="0"/>
-              </w:rPr>
-            </w:r>
-          </w:p>
-        </w:tc>
-        <w:tc>
-          <w:tcPr>
-            <w:tcBorders>
-              <w:left w:color="bfbfbf" w:space="0" w:sz="6" w:val="single"/>
-            </w:tcBorders>
-            <w:shd w:fill="f4cccc" w:val="clear"/>
-          </w:tcPr>
-          <w:p>
-            <w:pPr>
-              <w:rPr>
-                <w:rFonts w:ascii="Calibri" w:cs="Calibri" w:eastAsia="Calibri" w:hAnsi="Calibri"/>
-                <w:i w:val="1"/>
-                <w:iCs w:val="1"/>
-                <w:sz w:val="20"/>
-                <w:szCs w:val="20"/>
-              </w:rPr>
-            </w:pPr>
-            <w:r>
-              <w:rPr>
-                <w:i w:val="1"/>
-                <w:iCs w:val="1"/>
-                <w:sz w:val="20"/>
-                <w:szCs w:val="20"/>
-                <w:rtl w:val="0"/>
-              </w:rPr>
-              <w:t xml:space="preserve">Función de perfil que permite presentar tus logros o actividades.</w:t>
-            </w:r>
-            <w:r>
-              <w:rPr>
-                <w:rtl w:val="0"/>
-              </w:rPr>
-            </w:r>
-          </w:p>
-        </w:tc>
-        <w:tc>
-          <w:tcPr>
-            <w:shd w:fill="f4cccc" w:val="clear"/>
-          </w:tcPr>
-          <w:p>
-            <w:pPr>
-              <w:jc w:val="both"/>
-              <w:rPr>
-                <w:rFonts w:ascii="Calibri" w:cs="Calibri" w:eastAsia="Calibri" w:hAnsi="Calibri"/>
-                <w:i w:val="1"/>
-                <w:iCs w:val="1"/>
-                <w:color w:val="548dd4"/>
-                <w:sz w:val="18"/>
-                <w:szCs w:val="18"/>
-              </w:rPr>
-            </w:pPr>
-            <w:r>
-              <w:rPr>
-                <w:rtl w:val="0"/>
-              </w:rPr>
-            </w:r>
-          </w:p>
-        </w:tc>
-        <w:tc>
-          <w:tcPr>
-            <w:tcBorders>
-              <w:right w:color="ffffff" w:space="0" w:sz="4" w:val="single"/>
-            </w:tcBorders>
-            <w:shd w:fill="f4cccc" w:val="clear"/>
-          </w:tcPr>
-          <w:p>
-            <w:pPr>
-              <w:jc w:val="both"/>
-              <w:rPr>
-                <w:rFonts w:ascii="Calibri" w:cs="Calibri" w:eastAsia="Calibri" w:hAnsi="Calibri"/>
-                <w:i w:val="1"/>
-                <w:iCs w:val="1"/>
-                <w:color w:val="548dd4"/>
-                <w:sz w:val="18"/>
-                <w:szCs w:val="18"/>
-              </w:rPr>
-            </w:pPr>
-            <w:r>
-              <w:rPr>
-                <w:i w:val="1"/>
-                <w:iCs w:val="1"/>
-                <w:sz w:val="18"/>
-                <w:szCs w:val="18"/>
-                <w:rtl w:val="0"/>
-              </w:rPr>
-              <w:t xml:space="preserve">05-10-26 hasta 07-10-26</w:t>
-            </w:r>
-            <w:r>
-              <w:rPr>
-                <w:rtl w:val="0"/>
-              </w:rPr>
-            </w:r>
-          </w:p>
-        </w:tc>
-        <w:tc>
-          <w:tcPr>
-            <w:tcBorders>
-              <w:left w:color="ffffff" w:space="0" w:sz="4" w:val="single"/>
-            </w:tcBorders>
-            <w:shd w:fill="f4cccc" w:val="clear"/>
-          </w:tcPr>
-          <w:p>
-            <w:pPr>
-              <w:jc w:val="both"/>
-              <w:rPr>
-                <w:i w:val="1"/>
-                <w:iCs w:val="1"/>
-                <w:sz w:val="18"/>
-                <w:szCs w:val="18"/>
-              </w:rPr>
-            </w:pPr>
-            <w:r>
-              <w:rPr>
-                <w:i w:val="1"/>
-                <w:iCs w:val="1"/>
-                <w:sz w:val="18"/>
-                <w:szCs w:val="18"/>
-                <w:rtl w:val="0"/>
-              </w:rPr>
-              <w:t xml:space="preserve">Thalia y Vicente</w:t>
-            </w:r>
-          </w:p>
-        </w:tc>
-        <w:tc>
-          <w:tcPr>
-            <w:shd w:fill="f4cccc" w:val="clear"/>
-          </w:tcPr>
-          <w:p>
-            <w:pPr>
-              <w:jc w:val="both"/>
-              <w:rPr>
-                <w:rFonts w:ascii="Calibri" w:cs="Calibri" w:eastAsia="Calibri" w:hAnsi="Calibri"/>
-                <w:i w:val="1"/>
-                <w:iCs w:val="1"/>
-                <w:color w:val="548dd4"/>
-                <w:sz w:val="18"/>
-                <w:szCs w:val="18"/>
-              </w:rPr>
-            </w:pPr>
-            <w:r>
-              <w:rPr>
-                <w:rtl w:val="0"/>
-              </w:rPr>
-            </w:r>
-          </w:p>
-        </w:tc>
-      </w:tr>
-      <w:tr>
-        <w:trPr>
-          <w:cantSplit w:val="0"/>
-          <w:tblHeader w:val="0"/>
-        </w:trPr>
-        <w:tc>
-          <w:tcPr>
-            <w:tcBorders>
-              <w:right w:color="bfbfbf" w:space="0" w:sz="6" w:val="single"/>
-            </w:tcBorders>
-          </w:tcPr>
-          <w:p>
-            <w:pPr>
-              <w:pBdr>
-                <w:top w:color="auto" w:space="7" w:sz="0" w:val="none"/>
-                <w:bottom w:color="auto" w:space="7" w:sz="0" w:val="none"/>
-                <w:right w:color="auto" w:space="7" w:sz="0" w:val="none"/>
-                <w:between w:color="auto" w:space="7" w:sz="0" w:val="none"/>
-              </w:pBdr>
-              <w:shd w:fill="ffffff" w:val="clear"/>
-              <w:spacing w:after="0" w:before="0" w:lineRule="auto"/>
-              <w:rPr>
-                <w:color w:val="1a1a1a"/>
-                <w:sz w:val="20"/>
-                <w:szCs w:val="20"/>
-              </w:rPr>
-            </w:pPr>
-            <w:r>
-              <w:rPr>
-                <w:color w:val="1a1a1a"/>
-                <w:sz w:val="20"/>
-                <w:szCs w:val="20"/>
-                <w:rtl w:val="0"/>
-              </w:rPr>
-              <w:t xml:space="preserve">Bases de datos</w:t>
-            </w:r>
-          </w:p>
-          <w:p>
-            <w:pPr>
-              <w:pBdr>
-                <w:top w:color="auto" w:space="7" w:sz="0" w:val="none"/>
-                <w:bottom w:color="auto" w:space="7" w:sz="0" w:val="none"/>
-                <w:right w:color="auto" w:space="7" w:sz="0" w:val="none"/>
-                <w:between w:color="auto" w:space="7" w:sz="0" w:val="none"/>
-              </w:pBdr>
-              <w:shd w:fill="ffffff" w:val="clear"/>
-              <w:spacing w:after="0" w:before="0" w:lineRule="auto"/>
-              <w:rPr>
-                <w:rFonts w:ascii="Calibri" w:cs="Calibri" w:eastAsia="Calibri" w:hAnsi="Calibri"/>
                 <w:i w:val="1"/>
                 <w:iCs w:val="1"/>
                 <w:color w:val="548dd4"/>
@@ -11950,7 +11705,7 @@
                 <w:szCs w:val="20"/>
                 <w:rtl w:val="0"/>
               </w:rPr>
-              <w:t xml:space="preserve">Configuración de notificaciones y modo Focus</w:t>
+              <w:t xml:space="preserve">Sistema de puntuación por cumplimiento de actividades</w:t>
             </w:r>
             <w:r>
               <w:rPr>
@@ -11983,29 +11738,37 @@
                 <w:szCs w:val="20"/>
                 <w:rtl w:val="0"/>
               </w:rPr>
-              <w:t xml:space="preserve">Configuración de frecuencia de notificaciones y función que deshabilita otras funcionalidades hasta que se cumpla un objetivo.</w:t>
-            </w:r>
-            <w:r>
-              <w:rPr>
-                <w:rtl w:val="0"/>
-              </w:rPr>
-            </w:r>
-          </w:p>
-        </w:tc>
-        <w:tc>
-          <w:tcPr/>
-          <w:p>
-            <w:pPr>
-              <w:jc w:val="both"/>
+              <w:t xml:space="preserve">Sistema que registra un puntaje para determinar el estado de las mascotas.</w:t>
+            </w:r>
+            <w:r>
+              <w:rPr>
+                <w:rtl w:val="0"/>
+              </w:rPr>
+            </w:r>
+          </w:p>
+        </w:tc>
+        <w:tc>
+          <w:tcPr/>
+          <w:p>
+            <w:pPr>
               <w:rPr>
                 <w:rFonts w:ascii="Calibri" w:cs="Calibri" w:eastAsia="Calibri" w:hAnsi="Calibri"/>
                 <w:i w:val="1"/>
                 <w:iCs w:val="1"/>
-                <w:color w:val="548dd4"/>
-                <w:sz w:val="18"/>
-                <w:szCs w:val="18"/>
-              </w:rPr>
-            </w:pPr>
+                <w:sz w:val="18"/>
+                <w:szCs w:val="18"/>
+              </w:rPr>
+            </w:pPr>
+            <w:r>
+              <w:rPr>
+                <w:i w:val="1"/>
+                <w:iCs w:val="1"/>
+                <w:sz w:val="18"/>
+                <w:szCs w:val="18"/>
+                <w:rtl w:val="0"/>
+              </w:rPr>
+              <w:t xml:space="preserve">Android Studio, Visual Studio Code, SQLite, ordenador</w:t>
+            </w:r>
             <w:r>
               <w:rPr>
                 <w:rtl w:val="0"/>
@@ -12039,7 +11802,7 @@
                 <w:szCs w:val="18"/>
                 <w:rtl w:val="0"/>
               </w:rPr>
-              <w:t xml:space="preserve">07-10-26 hasta 09-10-26</w:t>
+              <w:t xml:space="preserve">30-09-26 hasta 05-10-26</w:t>
             </w:r>
             <w:r>
               <w:rPr>
@@ -12073,24 +11836,32 @@
                 <w:szCs w:val="18"/>
                 <w:rtl w:val="0"/>
               </w:rPr>
-              <w:t xml:space="preserve">Equipo completo</w:t>
-            </w:r>
-          </w:p>
-        </w:tc>
-        <w:tc>
-          <w:tcPr/>
-          <w:p>
-            <w:pPr>
-              <w:jc w:val="both"/>
+              <w:t xml:space="preserve">Thalia y Vicente</w:t>
+            </w:r>
+          </w:p>
+        </w:tc>
+        <w:tc>
+          <w:tcPr/>
+          <w:p>
+            <w:pPr>
               <w:rPr>
                 <w:rFonts w:ascii="Calibri" w:cs="Calibri" w:eastAsia="Calibri" w:hAnsi="Calibri"/>
                 <w:i w:val="1"/>
                 <w:iCs w:val="1"/>
-                <w:color w:val="548dd4"/>
-                <w:sz w:val="18"/>
-                <w:szCs w:val="18"/>
-              </w:rPr>
-            </w:pPr>
+                <w:sz w:val="18"/>
+                <w:szCs w:val="18"/>
+              </w:rPr>
+            </w:pPr>
+            <w:r>
+              <w:rPr>
+                <w:i w:val="1"/>
+                <w:iCs w:val="1"/>
+                <w:sz w:val="18"/>
+                <w:szCs w:val="18"/>
+                <w:rtl w:val="0"/>
+              </w:rPr>
+              <w:t xml:space="preserve">La poca experiencia con funcionalidades similares dificulta su desarrollo.</w:t>
+            </w:r>
             <w:r>
               <w:rPr>
                 <w:rtl w:val="0"/>
@@ -12121,7 +11892,32 @@
               <w:shd w:fill="ffffff" w:val="clear"/>
               <w:spacing w:after="0" w:before="0" w:lineRule="auto"/>
               <w:rPr>
-                <w:rFonts w:ascii="Calibri" w:cs="Calibri" w:eastAsia="Calibri" w:hAnsi="Calibri"/>
+                <w:color w:val="1a1a1a"/>
+                <w:sz w:val="20"/>
+                <w:szCs w:val="20"/>
+              </w:rPr>
+            </w:pPr>
+            <w:r>
+              <w:rPr>
+                <w:color w:val="1a1a1a"/>
+                <w:sz w:val="20"/>
+                <w:szCs w:val="20"/>
+                <w:rtl w:val="0"/>
+              </w:rPr>
+              <w:t xml:space="preserve">Bases de datos</w:t>
+            </w:r>
+          </w:p>
+          <w:p>
+            <w:pPr>
+              <w:pBdr>
+                <w:top w:color="auto" w:space="7" w:sz="0" w:val="none"/>
+                <w:bottom w:color="auto" w:space="7" w:sz="0" w:val="none"/>
+                <w:right w:color="auto" w:space="7" w:sz="0" w:val="none"/>
+                <w:between w:color="auto" w:space="7" w:sz="0" w:val="none"/>
+              </w:pBdr>
+              <w:shd w:fill="ffffff" w:val="clear"/>
+              <w:spacing w:after="0" w:before="0" w:lineRule="auto"/>
+              <w:rPr>
                 <w:i w:val="1"/>
                 <w:iCs w:val="1"/>
                 <w:color w:val="548dd4"/>
@@ -12178,7 +11974,7 @@
                 <w:szCs w:val="20"/>
                 <w:rtl w:val="0"/>
               </w:rPr>
-              <w:t xml:space="preserve">Establecimiento y obtención del tiempo de uso del teléfono</w:t>
+              <w:t xml:space="preserve">Personalización de perfil</w:t>
             </w:r>
             <w:r>
               <w:rPr>
@@ -12211,29 +12007,37 @@
                 <w:szCs w:val="20"/>
                 <w:rtl w:val="0"/>
               </w:rPr>
-              <w:t xml:space="preserve">Funcionalidad que permite registrar objetivos por tiempo.</w:t>
-            </w:r>
-            <w:r>
-              <w:rPr>
-                <w:rtl w:val="0"/>
-              </w:rPr>
-            </w:r>
-          </w:p>
-        </w:tc>
-        <w:tc>
-          <w:tcPr/>
-          <w:p>
-            <w:pPr>
-              <w:jc w:val="both"/>
+              <w:t xml:space="preserve">Función de perfil que permite presentar tus logros o actividades.</w:t>
+            </w:r>
+            <w:r>
+              <w:rPr>
+                <w:rtl w:val="0"/>
+              </w:rPr>
+            </w:r>
+          </w:p>
+        </w:tc>
+        <w:tc>
+          <w:tcPr/>
+          <w:p>
+            <w:pPr>
               <w:rPr>
                 <w:rFonts w:ascii="Calibri" w:cs="Calibri" w:eastAsia="Calibri" w:hAnsi="Calibri"/>
                 <w:i w:val="1"/>
                 <w:iCs w:val="1"/>
-                <w:color w:val="548dd4"/>
-                <w:sz w:val="18"/>
-                <w:szCs w:val="18"/>
-              </w:rPr>
-            </w:pPr>
+                <w:sz w:val="18"/>
+                <w:szCs w:val="18"/>
+              </w:rPr>
+            </w:pPr>
+            <w:r>
+              <w:rPr>
+                <w:i w:val="1"/>
+                <w:iCs w:val="1"/>
+                <w:sz w:val="18"/>
+                <w:szCs w:val="18"/>
+                <w:rtl w:val="0"/>
+              </w:rPr>
+              <w:t xml:space="preserve">Android Studio, Visual Studio Code, SQLite, ordenador</w:t>
+            </w:r>
             <w:r>
               <w:rPr>
                 <w:rtl w:val="0"/>
@@ -12267,7 +12071,7 @@
                 <w:szCs w:val="18"/>
                 <w:rtl w:val="0"/>
               </w:rPr>
-              <w:t xml:space="preserve">12-10-26 hasta 14-10-26</w:t>
+              <w:t xml:space="preserve">05-10-26 hasta 07-10-26</w:t>
             </w:r>
             <w:r>
               <w:rPr>
@@ -12301,24 +12105,32 @@
                 <w:szCs w:val="18"/>
                 <w:rtl w:val="0"/>
               </w:rPr>
-              <w:t xml:space="preserve">Vicente y Roberto</w:t>
-            </w:r>
-          </w:p>
-        </w:tc>
-        <w:tc>
-          <w:tcPr/>
-          <w:p>
-            <w:pPr>
-              <w:jc w:val="both"/>
+              <w:t xml:space="preserve">Thalia y Vicente</w:t>
+            </w:r>
+          </w:p>
+        </w:tc>
+        <w:tc>
+          <w:tcPr/>
+          <w:p>
+            <w:pPr>
               <w:rPr>
                 <w:rFonts w:ascii="Calibri" w:cs="Calibri" w:eastAsia="Calibri" w:hAnsi="Calibri"/>
                 <w:i w:val="1"/>
                 <w:iCs w:val="1"/>
-                <w:color w:val="548dd4"/>
-                <w:sz w:val="18"/>
-                <w:szCs w:val="18"/>
-              </w:rPr>
-            </w:pPr>
+                <w:sz w:val="18"/>
+                <w:szCs w:val="18"/>
+              </w:rPr>
+            </w:pPr>
+            <w:r>
+              <w:rPr>
+                <w:i w:val="1"/>
+                <w:iCs w:val="1"/>
+                <w:sz w:val="18"/>
+                <w:szCs w:val="18"/>
+                <w:rtl w:val="0"/>
+              </w:rPr>
+              <w:t xml:space="preserve">La poca experiencia con funcionalidades similares dificulta su desarrollo.</w:t>
+            </w:r>
             <w:r>
               <w:rPr>
                 <w:rtl w:val="0"/>
@@ -12338,6 +12150,32 @@
               <w:right w:color="bfbfbf" w:space="0" w:sz="6" w:val="single"/>
             </w:tcBorders>
           </w:tcPr>
+          <w:p>
+            <w:pPr>
+              <w:pBdr>
+                <w:top w:color="auto" w:space="7" w:sz="0" w:val="none"/>
+                <w:bottom w:color="auto" w:space="7" w:sz="0" w:val="none"/>
+                <w:right w:color="auto" w:space="7" w:sz="0" w:val="none"/>
+                <w:between w:color="auto" w:space="7" w:sz="0" w:val="none"/>
+              </w:pBdr>
+              <w:shd w:fill="ffffff" w:val="clear"/>
+              <w:spacing w:after="0" w:before="0" w:lineRule="auto"/>
+              <w:rPr>
+                <w:color w:val="1a1a1a"/>
+                <w:sz w:val="20"/>
+                <w:szCs w:val="20"/>
+              </w:rPr>
+            </w:pPr>
+            <w:r>
+              <w:rPr>
+                <w:color w:val="1a1a1a"/>
+                <w:sz w:val="20"/>
+                <w:szCs w:val="20"/>
+                <w:rtl w:val="0"/>
+              </w:rPr>
+              <w:t xml:space="preserve">Bases de datos</w:t>
+            </w:r>
+          </w:p>
           <w:p>
             <w:pPr>
               <w:pBdr>
@@ -12406,7 +12244,7 @@
                 <w:szCs w:val="20"/>
                 <w:rtl w:val="0"/>
               </w:rPr>
-              <w:t xml:space="preserve">Visualización de estadísticas del progreso del usuario</w:t>
+              <w:t xml:space="preserve">Configuración de notificaciones y modo Focus</w:t>
             </w:r>
             <w:r>
               <w:rPr>
@@ -12439,29 +12277,37 @@
                 <w:szCs w:val="20"/>
                 <w:rtl w:val="0"/>
               </w:rPr>
-              <w:t xml:space="preserve">Función de perfil que permite presentar tus logros o actividades.</w:t>
-            </w:r>
-            <w:r>
-              <w:rPr>
-                <w:rtl w:val="0"/>
-              </w:rPr>
-            </w:r>
-          </w:p>
-        </w:tc>
-        <w:tc>
-          <w:tcPr/>
-          <w:p>
-            <w:pPr>
-              <w:jc w:val="both"/>
+              <w:t xml:space="preserve">Configuración de frecuencia de notificaciones y función que deshabilita otras funcionalidades hasta que se cumpla un objetivo.</w:t>
+            </w:r>
+            <w:r>
+              <w:rPr>
+                <w:rtl w:val="0"/>
+              </w:rPr>
+            </w:r>
+          </w:p>
+        </w:tc>
+        <w:tc>
+          <w:tcPr/>
+          <w:p>
+            <w:pPr>
               <w:rPr>
                 <w:rFonts w:ascii="Calibri" w:cs="Calibri" w:eastAsia="Calibri" w:hAnsi="Calibri"/>
                 <w:i w:val="1"/>
                 <w:iCs w:val="1"/>
-                <w:color w:val="548dd4"/>
-                <w:sz w:val="18"/>
-                <w:szCs w:val="18"/>
-              </w:rPr>
-            </w:pPr>
+                <w:sz w:val="18"/>
+                <w:szCs w:val="18"/>
+              </w:rPr>
+            </w:pPr>
+            <w:r>
+              <w:rPr>
+                <w:i w:val="1"/>
+                <w:iCs w:val="1"/>
+                <w:sz w:val="18"/>
+                <w:szCs w:val="18"/>
+                <w:rtl w:val="0"/>
+              </w:rPr>
+              <w:t xml:space="preserve">Android Studio, Visual Studio Code, SQLite, ordenador</w:t>
+            </w:r>
             <w:r>
               <w:rPr>
                 <w:rtl w:val="0"/>
@@ -12495,7 +12341,7 @@
                 <w:szCs w:val="18"/>
                 <w:rtl w:val="0"/>
               </w:rPr>
-              <w:t xml:space="preserve">18-10-26 hasta 21-10-26</w:t>
+              <w:t xml:space="preserve">07-10-26 hasta 09-10-26</w:t>
             </w:r>
             <w:r>
               <w:rPr>
@@ -12529,6 +12375,482 @@
                 <w:szCs w:val="18"/>
                 <w:rtl w:val="0"/>
               </w:rPr>
+              <w:t xml:space="preserve">Equipo completo</w:t>
+            </w:r>
+          </w:p>
+        </w:tc>
+        <w:tc>
+          <w:tcPr/>
+          <w:p>
+            <w:pPr>
+              <w:rPr>
+                <w:rFonts w:ascii="Calibri" w:cs="Calibri" w:eastAsia="Calibri" w:hAnsi="Calibri"/>
+                <w:i w:val="1"/>
+                <w:iCs w:val="1"/>
+                <w:sz w:val="18"/>
+                <w:szCs w:val="18"/>
+              </w:rPr>
+            </w:pPr>
+            <w:r>
+              <w:rPr>
+                <w:i w:val="1"/>
+                <w:iCs w:val="1"/>
+                <w:sz w:val="18"/>
+                <w:szCs w:val="18"/>
+                <w:rtl w:val="0"/>
+              </w:rPr>
+              <w:t xml:space="preserve">La poca experiencia con funcionalidades similares dificulta su desarrollo.</w:t>
+            </w:r>
+            <w:r>
+              <w:rPr>
+                <w:rtl w:val="0"/>
+              </w:rPr>
+            </w:r>
+          </w:p>
+        </w:tc>
+      </w:tr>
+      <w:tr>
+        <w:trPr>
+          <w:cantSplit w:val="0"/>
+          <w:tblHeader w:val="0"/>
+        </w:trPr>
+        <w:tc>
+          <w:tcPr>
+            <w:tcBorders>
+              <w:right w:color="bfbfbf" w:space="0" w:sz="6" w:val="single"/>
+            </w:tcBorders>
+          </w:tcPr>
+          <w:p>
+            <w:pPr>
+              <w:pBdr>
+                <w:top w:color="auto" w:space="7" w:sz="0" w:val="none"/>
+                <w:bottom w:color="auto" w:space="7" w:sz="0" w:val="none"/>
+                <w:right w:color="auto" w:space="7" w:sz="0" w:val="none"/>
+                <w:between w:color="auto" w:space="7" w:sz="0" w:val="none"/>
+              </w:pBdr>
+              <w:shd w:fill="ffffff" w:val="clear"/>
+              <w:spacing w:after="0" w:before="0" w:lineRule="auto"/>
+              <w:rPr>
+                <w:rFonts w:ascii="Calibri" w:cs="Calibri" w:eastAsia="Calibri" w:hAnsi="Calibri"/>
+                <w:i w:val="1"/>
+                <w:iCs w:val="1"/>
+                <w:color w:val="548dd4"/>
+                <w:sz w:val="18"/>
+                <w:szCs w:val="18"/>
+              </w:rPr>
+            </w:pPr>
+            <w:r>
+              <w:rPr>
+                <w:color w:val="1a1a1a"/>
+                <w:sz w:val="20"/>
+                <w:szCs w:val="20"/>
+                <w:rtl w:val="0"/>
+              </w:rPr>
+              <w:t xml:space="preserve">Dispositivos móviles</w:t>
+            </w:r>
+            <w:r>
+              <w:rPr>
+                <w:rtl w:val="0"/>
+              </w:rPr>
+            </w:r>
+          </w:p>
+        </w:tc>
+        <w:tc>
+          <w:tcPr>
+            <w:tcBorders>
+              <w:top w:color="bfbfbf" w:space="0" w:sz="6" w:val="single"/>
+              <w:left w:color="bfbfbf" w:space="0" w:sz="6" w:val="single"/>
+              <w:bottom w:color="bfbfbf" w:space="0" w:sz="6" w:val="single"/>
+              <w:right w:color="bfbfbf" w:space="0" w:sz="6" w:val="single"/>
+            </w:tcBorders>
+            <w:tcMar>
+              <w:top w:w="0.0" w:type="dxa"/>
+              <w:left w:w="40.0" w:type="dxa"/>
+              <w:bottom w:w="0.0" w:type="dxa"/>
+              <w:right w:w="40.0" w:type="dxa"/>
+            </w:tcMar>
+            <w:vAlign w:val="top"/>
+          </w:tcPr>
+          <w:p>
+            <w:pPr>
+              <w:rPr>
+                <w:i w:val="1"/>
+                <w:iCs w:val="1"/>
+                <w:sz w:val="20"/>
+                <w:szCs w:val="20"/>
+              </w:rPr>
+            </w:pPr>
+            <w:r>
+              <w:rPr>
+                <w:i w:val="1"/>
+                <w:iCs w:val="1"/>
+                <w:sz w:val="20"/>
+                <w:szCs w:val="20"/>
+                <w:rtl w:val="0"/>
+              </w:rPr>
+              <w:t xml:space="preserve">Establecimiento y obtención del tiempo de uso del teléfono</w:t>
+            </w:r>
+            <w:r>
+              <w:rPr>
+                <w:rtl w:val="0"/>
+              </w:rPr>
+            </w:r>
+          </w:p>
+        </w:tc>
+        <w:tc>
+          <w:tcPr>
+            <w:tcBorders>
+              <w:left w:color="bfbfbf" w:space="0" w:sz="6" w:val="single"/>
+            </w:tcBorders>
+          </w:tcPr>
+          <w:p>
+            <w:pPr>
+              <w:rPr>
+                <w:rFonts w:ascii="Calibri" w:cs="Calibri" w:eastAsia="Calibri" w:hAnsi="Calibri"/>
+                <w:i w:val="1"/>
+                <w:iCs w:val="1"/>
+                <w:sz w:val="20"/>
+                <w:szCs w:val="20"/>
+              </w:rPr>
+            </w:pPr>
+            <w:r>
+              <w:rPr>
+                <w:i w:val="1"/>
+                <w:iCs w:val="1"/>
+                <w:sz w:val="20"/>
+                <w:szCs w:val="20"/>
+                <w:rtl w:val="0"/>
+              </w:rPr>
+              <w:t xml:space="preserve">Funcionalidad que permite registrar objetivos por tiempo.</w:t>
+            </w:r>
+            <w:r>
+              <w:rPr>
+                <w:rtl w:val="0"/>
+              </w:rPr>
+            </w:r>
+          </w:p>
+        </w:tc>
+        <w:tc>
+          <w:tcPr/>
+          <w:p>
+            <w:pPr>
+              <w:rPr>
+                <w:i w:val="1"/>
+                <w:iCs w:val="1"/>
+                <w:sz w:val="18"/>
+                <w:szCs w:val="18"/>
+              </w:rPr>
+            </w:pPr>
+            <w:r>
+              <w:rPr>
+                <w:i w:val="1"/>
+                <w:iCs w:val="1"/>
+                <w:sz w:val="18"/>
+                <w:szCs w:val="18"/>
+                <w:rtl w:val="0"/>
+              </w:rPr>
+              <w:t xml:space="preserve">Android Studio, Visual Studio Code, ordenador</w:t>
+            </w:r>
+          </w:p>
+        </w:tc>
+        <w:tc>
+          <w:tcPr>
+            <w:tcBorders>
+              <w:right w:color="ffffff" w:space="0" w:sz="4" w:val="single"/>
+            </w:tcBorders>
+          </w:tcPr>
+          <w:p>
+            <w:pPr>
+              <w:jc w:val="both"/>
+              <w:rPr>
+                <w:rFonts w:ascii="Calibri" w:cs="Calibri" w:eastAsia="Calibri" w:hAnsi="Calibri"/>
+                <w:i w:val="1"/>
+                <w:iCs w:val="1"/>
+                <w:color w:val="548dd4"/>
+                <w:sz w:val="18"/>
+                <w:szCs w:val="18"/>
+              </w:rPr>
+            </w:pPr>
+            <w:r>
+              <w:rPr>
+                <w:i w:val="1"/>
+                <w:iCs w:val="1"/>
+                <w:sz w:val="18"/>
+                <w:szCs w:val="18"/>
+                <w:rtl w:val="0"/>
+              </w:rPr>
+              <w:t xml:space="preserve">12-10-26 hasta 14-10-26</w:t>
+            </w:r>
+            <w:r>
+              <w:rPr>
+                <w:rtl w:val="0"/>
+              </w:rPr>
+            </w:r>
+          </w:p>
+        </w:tc>
+        <w:tc>
+          <w:tcPr>
+            <w:tcBorders>
+              <w:left w:color="ffffff" w:space="0" w:sz="4" w:val="single"/>
+            </w:tcBorders>
+            <w:shd w:fill="d9d9d9" w:val="clear"/>
+          </w:tcPr>
+          <w:p>
+            <w:pPr>
+              <w:jc w:val="both"/>
+              <w:rPr>
+                <w:i w:val="1"/>
+                <w:iCs w:val="1"/>
+                <w:sz w:val="18"/>
+                <w:szCs w:val="18"/>
+              </w:rPr>
+            </w:pPr>
+            <w:r>
+              <w:rPr>
+                <w:i w:val="1"/>
+                <w:iCs w:val="1"/>
+                <w:sz w:val="18"/>
+                <w:szCs w:val="18"/>
+                <w:rtl w:val="0"/>
+              </w:rPr>
+              <w:t xml:space="preserve">Vicente y Roberto</w:t>
+            </w:r>
+          </w:p>
+        </w:tc>
+        <w:tc>
+          <w:tcPr/>
+          <w:p>
+            <w:pPr>
+              <w:rPr>
+                <w:rFonts w:ascii="Calibri" w:cs="Calibri" w:eastAsia="Calibri" w:hAnsi="Calibri"/>
+                <w:i w:val="1"/>
+                <w:iCs w:val="1"/>
+                <w:sz w:val="18"/>
+                <w:szCs w:val="18"/>
+              </w:rPr>
+            </w:pPr>
+            <w:r>
+              <w:rPr>
+                <w:i w:val="1"/>
+                <w:iCs w:val="1"/>
+                <w:sz w:val="18"/>
+                <w:szCs w:val="18"/>
+                <w:rtl w:val="0"/>
+              </w:rPr>
+              <w:t xml:space="preserve">La poca experiencia con funcionalidades similares dificulta su desarrollo.</w:t>
+            </w:r>
+            <w:r>
+              <w:rPr>
+                <w:rtl w:val="0"/>
+              </w:rPr>
+            </w:r>
+          </w:p>
+        </w:tc>
+      </w:tr>
+      <w:tr>
+        <w:trPr>
+          <w:cantSplit w:val="0"/>
+          <w:tblHeader w:val="0"/>
+        </w:trPr>
+        <w:tc>
+          <w:tcPr>
+            <w:tcBorders>
+              <w:right w:color="bfbfbf" w:space="0" w:sz="6" w:val="single"/>
+            </w:tcBorders>
+          </w:tcPr>
+          <w:p>
+            <w:pPr>
+              <w:pBdr>
+                <w:top w:color="auto" w:space="7" w:sz="0" w:val="none"/>
+                <w:bottom w:color="auto" w:space="7" w:sz="0" w:val="none"/>
+                <w:right w:color="auto" w:space="7" w:sz="0" w:val="none"/>
+                <w:between w:color="auto" w:space="7" w:sz="0" w:val="none"/>
+              </w:pBdr>
+              <w:shd w:fill="ffffff" w:val="clear"/>
+              <w:spacing w:after="0" w:before="0" w:lineRule="auto"/>
+              <w:rPr>
+                <w:rFonts w:ascii="Calibri" w:cs="Calibri" w:eastAsia="Calibri" w:hAnsi="Calibri"/>
+                <w:i w:val="1"/>
+                <w:iCs w:val="1"/>
+                <w:color w:val="548dd4"/>
+                <w:sz w:val="18"/>
+                <w:szCs w:val="18"/>
+              </w:rPr>
+            </w:pPr>
+            <w:r>
+              <w:rPr>
+                <w:color w:val="1a1a1a"/>
+                <w:sz w:val="20"/>
+                <w:szCs w:val="20"/>
+                <w:rtl w:val="0"/>
+              </w:rPr>
+              <w:t xml:space="preserve">Dispositivos móviles</w:t>
+            </w:r>
+            <w:r>
+              <w:rPr>
+                <w:rtl w:val="0"/>
+              </w:rPr>
+            </w:r>
+          </w:p>
+        </w:tc>
+        <w:tc>
+          <w:tcPr>
+            <w:tcBorders>
+              <w:top w:color="bfbfbf" w:space="0" w:sz="6" w:val="single"/>
+              <w:left w:color="bfbfbf" w:space="0" w:sz="6" w:val="single"/>
+              <w:bottom w:color="bfbfbf" w:space="0" w:sz="6" w:val="single"/>
+              <w:right w:color="bfbfbf" w:space="0" w:sz="6" w:val="single"/>
+            </w:tcBorders>
+            <w:tcMar>
+              <w:top w:w="0.0" w:type="dxa"/>
+              <w:left w:w="40.0" w:type="dxa"/>
+              <w:bottom w:w="0.0" w:type="dxa"/>
+              <w:right w:w="40.0" w:type="dxa"/>
+            </w:tcMar>
+            <w:vAlign w:val="top"/>
+          </w:tcPr>
+          <w:p>
+            <w:pPr>
+              <w:rPr>
+                <w:i w:val="1"/>
+                <w:iCs w:val="1"/>
+                <w:sz w:val="20"/>
+                <w:szCs w:val="20"/>
+              </w:rPr>
+            </w:pPr>
+            <w:r>
+              <w:rPr>
+                <w:i w:val="1"/>
+                <w:iCs w:val="1"/>
+                <w:sz w:val="20"/>
+                <w:szCs w:val="20"/>
+                <w:rtl w:val="0"/>
+              </w:rPr>
+              <w:t xml:space="preserve">Visualización de estadísticas del progreso del usuario</w:t>
+            </w:r>
+            <w:r>
+              <w:rPr>
+                <w:rtl w:val="0"/>
+              </w:rPr>
+            </w:r>
+          </w:p>
+        </w:tc>
+        <w:tc>
+          <w:tcPr>
+            <w:tcBorders>
+              <w:left w:color="bfbfbf" w:space="0" w:sz="6" w:val="single"/>
+            </w:tcBorders>
+          </w:tcPr>
+          <w:p>
+            <w:pPr>
+              <w:rPr>
+                <w:rFonts w:ascii="Calibri" w:cs="Calibri" w:eastAsia="Calibri" w:hAnsi="Calibri"/>
+                <w:i w:val="1"/>
+                <w:iCs w:val="1"/>
+                <w:sz w:val="20"/>
+                <w:szCs w:val="20"/>
+              </w:rPr>
+            </w:pPr>
+            <w:r>
+              <w:rPr>
+                <w:i w:val="1"/>
+                <w:iCs w:val="1"/>
+                <w:sz w:val="20"/>
+                <w:szCs w:val="20"/>
+                <w:rtl w:val="0"/>
+              </w:rPr>
+              <w:t xml:space="preserve">Función de perfil que permite ver tus logros.</w:t>
+            </w:r>
+            <w:r>
+              <w:rPr>
+                <w:rtl w:val="0"/>
+              </w:rPr>
+            </w:r>
+          </w:p>
+        </w:tc>
+        <w:tc>
+          <w:tcPr/>
+          <w:p>
+            <w:pPr>
+              <w:rPr>
+                <w:i w:val="1"/>
+                <w:iCs w:val="1"/>
+                <w:sz w:val="18"/>
+                <w:szCs w:val="18"/>
+              </w:rPr>
+            </w:pPr>
+            <w:r>
+              <w:rPr>
+                <w:i w:val="1"/>
+                <w:iCs w:val="1"/>
+                <w:sz w:val="18"/>
+                <w:szCs w:val="18"/>
+                <w:rtl w:val="0"/>
+              </w:rPr>
+              <w:t xml:space="preserve">Android Studio, Visual Studio Code, ordenador</w:t>
+            </w:r>
+          </w:p>
+        </w:tc>
+        <w:tc>
+          <w:tcPr>
+            <w:tcBorders>
+              <w:right w:color="ffffff" w:space="0" w:sz="4" w:val="single"/>
+            </w:tcBorders>
+          </w:tcPr>
+          <w:p>
+            <w:pPr>
+              <w:jc w:val="both"/>
+              <w:rPr>
+                <w:rFonts w:ascii="Calibri" w:cs="Calibri" w:eastAsia="Calibri" w:hAnsi="Calibri"/>
+                <w:i w:val="1"/>
+                <w:iCs w:val="1"/>
+                <w:color w:val="548dd4"/>
+                <w:sz w:val="18"/>
+                <w:szCs w:val="18"/>
+              </w:rPr>
+            </w:pPr>
+            <w:r>
+              <w:rPr>
+                <w:i w:val="1"/>
+                <w:iCs w:val="1"/>
+                <w:sz w:val="18"/>
+                <w:szCs w:val="18"/>
+                <w:rtl w:val="0"/>
+              </w:rPr>
+              <w:t xml:space="preserve">18-10-26 hasta 21-10-26</w:t>
+            </w:r>
+            <w:r>
+              <w:rPr>
+                <w:rtl w:val="0"/>
+              </w:rPr>
+            </w:r>
+          </w:p>
+        </w:tc>
+        <w:tc>
+          <w:tcPr>
+            <w:tcBorders>
+              <w:left w:color="ffffff" w:space="0" w:sz="4" w:val="single"/>
+            </w:tcBorders>
+            <w:shd w:fill="d9d9d9" w:val="clear"/>
+          </w:tcPr>
+          <w:p>
+            <w:pPr>
+              <w:jc w:val="both"/>
+              <w:rPr>
+                <w:i w:val="1"/>
+                <w:iCs w:val="1"/>
+                <w:sz w:val="18"/>
+                <w:szCs w:val="18"/>
+              </w:rPr>
+            </w:pPr>
+            <w:r>
+              <w:rPr>
+                <w:i w:val="1"/>
+                <w:iCs w:val="1"/>
+                <w:sz w:val="18"/>
+                <w:szCs w:val="18"/>
+                <w:rtl w:val="0"/>
+              </w:rPr>
               <w:t xml:space="preserve">Thalia y Vicente</w:t>
             </w:r>
           </w:p>
@@ -12537,16 +12859,24 @@
           <w:tcPr/>
           <w:p>
             <w:pPr>
-              <w:jc w:val="both"/>
               <w:rPr>
                 <w:rFonts w:ascii="Calibri" w:cs="Calibri" w:eastAsia="Calibri" w:hAnsi="Calibri"/>
                 <w:i w:val="1"/>
                 <w:iCs w:val="1"/>
-                <w:color w:val="548dd4"/>
-                <w:sz w:val="18"/>
-                <w:szCs w:val="18"/>
-              </w:rPr>
-            </w:pPr>
+                <w:sz w:val="18"/>
+                <w:szCs w:val="18"/>
+              </w:rPr>
+            </w:pPr>
+            <w:r>
+              <w:rPr>
+                <w:i w:val="1"/>
+                <w:iCs w:val="1"/>
+                <w:sz w:val="18"/>
+                <w:szCs w:val="18"/>
+                <w:rtl w:val="0"/>
+              </w:rPr>
+              <w:t xml:space="preserve">Experiencias con otras interfaces de estadísticas facilita el desarrollo de esta tarea.</w:t>
+            </w:r>
             <w:r>
               <w:rPr>
                 <w:rtl w:val="0"/>
@@ -12732,20 +13062,22 @@
           <w:tcPr/>
           <w:p>
             <w:pPr>
-              <w:jc w:val="both"/>
-              <w:rPr>
-                <w:rFonts w:ascii="Calibri" w:cs="Calibri" w:eastAsia="Calibri" w:hAnsi="Calibri"/>
-                <w:i w:val="1"/>
-                <w:iCs w:val="1"/>
-                <w:color w:val="548dd4"/>
-                <w:sz w:val="18"/>
-                <w:szCs w:val="18"/>
-              </w:rPr>
-            </w:pPr>
-            <w:r>
-              <w:rPr>
-                <w:rtl w:val="0"/>
-              </w:rPr>
+              <w:rPr>
+                <w:i w:val="1"/>
+                <w:iCs w:val="1"/>
+                <w:sz w:val="18"/>
+                <w:szCs w:val="18"/>
+              </w:rPr>
+            </w:pPr>
+            <w:r>
+              <w:rPr>
+                <w:i w:val="1"/>
+                <w:iCs w:val="1"/>
+                <w:sz w:val="18"/>
+                <w:szCs w:val="18"/>
+                <w:rtl w:val="0"/>
+              </w:rPr>
+              <w:t xml:space="preserve">Android Studio, Visual Studio Code, SQLite, ordenador</w:t>
             </w:r>
           </w:p>
         </w:tc>
@@ -12817,16 +13149,24 @@
           <w:tcPr/>
           <w:p>
             <w:pPr>
-              <w:jc w:val="both"/>
               <w:rPr>
                 <w:rFonts w:ascii="Calibri" w:cs="Calibri" w:eastAsia="Calibri" w:hAnsi="Calibri"/>
                 <w:i w:val="1"/>
                 <w:iCs w:val="1"/>
-                <w:color w:val="548dd4"/>
-                <w:sz w:val="18"/>
-                <w:szCs w:val="18"/>
-              </w:rPr>
-            </w:pPr>
+                <w:sz w:val="18"/>
+                <w:szCs w:val="18"/>
+              </w:rPr>
+            </w:pPr>
+            <w:r>
+              <w:rPr>
+                <w:i w:val="1"/>
+                <w:iCs w:val="1"/>
+                <w:sz w:val="18"/>
+                <w:szCs w:val="18"/>
+                <w:rtl w:val="0"/>
+              </w:rPr>
+              <w:t xml:space="preserve">Permitirá analizar la correcta funcionalidad de las acciones necesarias para la aplicación.</w:t>
+            </w:r>
             <w:r>
               <w:rPr>
                 <w:rtl w:val="0"/>
@@ -12985,20 +13325,22 @@
           <w:tcPr/>
           <w:p>
             <w:pPr>
-              <w:jc w:val="both"/>
-              <w:rPr>
-                <w:rFonts w:ascii="Calibri" w:cs="Calibri" w:eastAsia="Calibri" w:hAnsi="Calibri"/>
-                <w:i w:val="1"/>
-                <w:iCs w:val="1"/>
-                <w:color w:val="548dd4"/>
-                <w:sz w:val="18"/>
-                <w:szCs w:val="18"/>
-              </w:rPr>
-            </w:pPr>
-            <w:r>
-              <w:rPr>
-                <w:rtl w:val="0"/>
-              </w:rPr>
+              <w:rPr>
+                <w:i w:val="1"/>
+                <w:iCs w:val="1"/>
+                <w:sz w:val="18"/>
+                <w:szCs w:val="18"/>
+              </w:rPr>
+            </w:pPr>
+            <w:r>
+              <w:rPr>
+                <w:i w:val="1"/>
+                <w:iCs w:val="1"/>
+                <w:sz w:val="18"/>
+                <w:szCs w:val="18"/>
+                <w:rtl w:val="0"/>
+              </w:rPr>
+              <w:t xml:space="preserve">Android Studio, Visual Studio Code, SQLite, ordenador</w:t>
             </w:r>
           </w:p>
         </w:tc>
@@ -13070,16 +13412,24 @@
           <w:tcPr/>
           <w:p>
             <w:pPr>
-              <w:jc w:val="both"/>
               <w:rPr>
                 <w:rFonts w:ascii="Calibri" w:cs="Calibri" w:eastAsia="Calibri" w:hAnsi="Calibri"/>
                 <w:i w:val="1"/>
                 <w:iCs w:val="1"/>
-                <w:color w:val="548dd4"/>
-                <w:sz w:val="18"/>
-                <w:szCs w:val="18"/>
-              </w:rPr>
-            </w:pPr>
+                <w:sz w:val="18"/>
+                <w:szCs w:val="18"/>
+              </w:rPr>
+            </w:pPr>
+            <w:r>
+              <w:rPr>
+                <w:i w:val="1"/>
+                <w:iCs w:val="1"/>
+                <w:sz w:val="18"/>
+                <w:szCs w:val="18"/>
+                <w:rtl w:val="0"/>
+              </w:rPr>
+              <w:t xml:space="preserve">Permiten probar individualmente cada funcionalidad.</w:t>
+            </w:r>
             <w:r>
               <w:rPr>
                 <w:rtl w:val="0"/>
@@ -13222,20 +13572,22 @@
           <w:tcPr/>
           <w:p>
             <w:pPr>
-              <w:jc w:val="both"/>
-              <w:rPr>
-                <w:rFonts w:ascii="Calibri" w:cs="Calibri" w:eastAsia="Calibri" w:hAnsi="Calibri"/>
-                <w:i w:val="1"/>
-                <w:iCs w:val="1"/>
-                <w:color w:val="548dd4"/>
-                <w:sz w:val="18"/>
-                <w:szCs w:val="18"/>
-              </w:rPr>
-            </w:pPr>
-            <w:r>
-              <w:rPr>
-                <w:rtl w:val="0"/>
-              </w:rPr>
+              <w:rPr>
+                <w:i w:val="1"/>
+                <w:iCs w:val="1"/>
+                <w:sz w:val="18"/>
+                <w:szCs w:val="18"/>
+              </w:rPr>
+            </w:pPr>
+            <w:r>
+              <w:rPr>
+                <w:i w:val="1"/>
+                <w:iCs w:val="1"/>
+                <w:sz w:val="18"/>
+                <w:szCs w:val="18"/>
+                <w:rtl w:val="0"/>
+              </w:rPr>
+              <w:t xml:space="preserve">Android Studio, Visual Studio Code, SQLite, ordenador</w:t>
             </w:r>
           </w:p>
         </w:tc>
@@ -13307,16 +13659,24 @@
           <w:tcPr/>
           <w:p>
             <w:pPr>
-              <w:jc w:val="both"/>
               <w:rPr>
                 <w:rFonts w:ascii="Calibri" w:cs="Calibri" w:eastAsia="Calibri" w:hAnsi="Calibri"/>
                 <w:i w:val="1"/>
                 <w:iCs w:val="1"/>
-                <w:color w:val="548dd4"/>
-                <w:sz w:val="18"/>
-                <w:szCs w:val="18"/>
-              </w:rPr>
-            </w:pPr>
+                <w:sz w:val="18"/>
+                <w:szCs w:val="18"/>
+              </w:rPr>
+            </w:pPr>
+            <w:r>
+              <w:rPr>
+                <w:i w:val="1"/>
+                <w:iCs w:val="1"/>
+                <w:sz w:val="18"/>
+                <w:szCs w:val="18"/>
+                <w:rtl w:val="0"/>
+              </w:rPr>
+              <w:t xml:space="preserve">Permiten probar la usabilidad de la aplicación.</w:t>
+            </w:r>
             <w:r>
               <w:rPr>
                 <w:rtl w:val="0"/>
@@ -13453,7 +13813,7 @@
                 <w:between w:color="auto" w:space="7" w:sz="0" w:val="none"/>
               </w:pBdr>
               <w:shd w:fill="ffffff" w:val="clear"/>
-              <w:spacing w:after="0" w:before="180" w:lineRule="auto"/>
+              <w:spacing w:after="0" w:before="0" w:lineRule="auto"/>
               <w:rPr>
                 <w:i w:val="1"/>
                 <w:iCs w:val="1"/>
@@ -13480,20 +13840,22 @@
           <w:tcPr/>
           <w:p>
             <w:pPr>
-              <w:jc w:val="both"/>
-              <w:rPr>
-                <w:rFonts w:ascii="Calibri" w:cs="Calibri" w:eastAsia="Calibri" w:hAnsi="Calibri"/>
-                <w:i w:val="1"/>
-                <w:iCs w:val="1"/>
-                <w:color w:val="548dd4"/>
-                <w:sz w:val="18"/>
-                <w:szCs w:val="18"/>
-              </w:rPr>
-            </w:pPr>
-            <w:r>
-              <w:rPr>
-                <w:rtl w:val="0"/>
-              </w:rPr>
+              <w:rPr>
+                <w:i w:val="1"/>
+                <w:iCs w:val="1"/>
+                <w:sz w:val="18"/>
+                <w:szCs w:val="18"/>
+              </w:rPr>
+            </w:pPr>
+            <w:r>
+              <w:rPr>
+                <w:i w:val="1"/>
+                <w:iCs w:val="1"/>
+                <w:sz w:val="18"/>
+                <w:szCs w:val="18"/>
+                <w:rtl w:val="0"/>
+              </w:rPr>
+              <w:t xml:space="preserve">Android Studio, Visual Studio Code, ordenador</w:t>
             </w:r>
           </w:p>
         </w:tc>
@@ -13565,16 +13927,24 @@
           <w:tcPr/>
           <w:p>
             <w:pPr>
-              <w:jc w:val="both"/>
               <w:rPr>
                 <w:rFonts w:ascii="Calibri" w:cs="Calibri" w:eastAsia="Calibri" w:hAnsi="Calibri"/>
                 <w:i w:val="1"/>
                 <w:iCs w:val="1"/>
-                <w:color w:val="548dd4"/>
-                <w:sz w:val="18"/>
-                <w:szCs w:val="18"/>
-              </w:rPr>
-            </w:pPr>
+                <w:sz w:val="18"/>
+                <w:szCs w:val="18"/>
+              </w:rPr>
+            </w:pPr>
+            <w:r>
+              <w:rPr>
+                <w:i w:val="1"/>
+                <w:iCs w:val="1"/>
+                <w:sz w:val="18"/>
+                <w:szCs w:val="18"/>
+                <w:rtl w:val="0"/>
+              </w:rPr>
+              <w:t xml:space="preserve">Puesta en marcha de la aplicación, la dependencia de validar las pruebas anteriores dificultan esta tarea.</w:t>
+            </w:r>
             <w:r>
               <w:rPr>
                 <w:rtl w:val="0"/>
@@ -13708,16 +14078,24 @@
           <w:tcPr/>
           <w:p>
             <w:pPr>
-              <w:jc w:val="both"/>
               <w:rPr>
                 <w:rFonts w:ascii="Calibri" w:cs="Calibri" w:eastAsia="Calibri" w:hAnsi="Calibri"/>
                 <w:i w:val="1"/>
                 <w:iCs w:val="1"/>
-                <w:color w:val="548dd4"/>
-                <w:sz w:val="18"/>
-                <w:szCs w:val="18"/>
-              </w:rPr>
-            </w:pPr>
+                <w:sz w:val="18"/>
+                <w:szCs w:val="18"/>
+              </w:rPr>
+            </w:pPr>
+            <w:r>
+              <w:rPr>
+                <w:i w:val="1"/>
+                <w:iCs w:val="1"/>
+                <w:sz w:val="18"/>
+                <w:szCs w:val="18"/>
+                <w:rtl w:val="0"/>
+              </w:rPr>
+              <w:t xml:space="preserve">Documentos y ordenador</w:t>
+            </w:r>
             <w:r>
               <w:rPr>
                 <w:rtl w:val="0"/>
@@ -13793,16 +14171,24 @@
           <w:tcPr/>
           <w:p>
             <w:pPr>
-              <w:jc w:val="both"/>
               <w:rPr>
                 <w:rFonts w:ascii="Calibri" w:cs="Calibri" w:eastAsia="Calibri" w:hAnsi="Calibri"/>
                 <w:i w:val="1"/>
                 <w:iCs w:val="1"/>
-                <w:color w:val="548dd4"/>
-                <w:sz w:val="18"/>
-                <w:szCs w:val="18"/>
-              </w:rPr>
-            </w:pPr>
+                <w:sz w:val="18"/>
+                <w:szCs w:val="18"/>
+              </w:rPr>
+            </w:pPr>
+            <w:r>
+              <w:rPr>
+                <w:i w:val="1"/>
+                <w:iCs w:val="1"/>
+                <w:sz w:val="18"/>
+                <w:szCs w:val="18"/>
+                <w:rtl w:val="0"/>
+              </w:rPr>
+              <w:t xml:space="preserve">Preparar a personas responsables de la aplicación facilitara su correcto funcionamiento a futuro.</w:t>
+            </w:r>
             <w:r>
               <w:rPr>
                 <w:rtl w:val="0"/>
@@ -13936,20 +14322,22 @@
           <w:tcPr/>
           <w:p>
             <w:pPr>
-              <w:jc w:val="both"/>
-              <w:rPr>
-                <w:rFonts w:ascii="Calibri" w:cs="Calibri" w:eastAsia="Calibri" w:hAnsi="Calibri"/>
-                <w:i w:val="1"/>
-                <w:iCs w:val="1"/>
-                <w:color w:val="548dd4"/>
-                <w:sz w:val="18"/>
-                <w:szCs w:val="18"/>
-              </w:rPr>
-            </w:pPr>
-            <w:r>
-              <w:rPr>
-                <w:rtl w:val="0"/>
-              </w:rPr>
+              <w:rPr>
+                <w:i w:val="1"/>
+                <w:iCs w:val="1"/>
+                <w:sz w:val="18"/>
+                <w:szCs w:val="18"/>
+              </w:rPr>
+            </w:pPr>
+            <w:r>
+              <w:rPr>
+                <w:i w:val="1"/>
+                <w:iCs w:val="1"/>
+                <w:sz w:val="18"/>
+                <w:szCs w:val="18"/>
+                <w:rtl w:val="0"/>
+              </w:rPr>
+              <w:t xml:space="preserve">Documentos y ordenador</w:t>
             </w:r>
           </w:p>
         </w:tc>
@@ -14021,16 +14409,24 @@
           <w:tcPr/>
           <w:p>
             <w:pPr>
-              <w:jc w:val="both"/>
               <w:rPr>
                 <w:rFonts w:ascii="Calibri" w:cs="Calibri" w:eastAsia="Calibri" w:hAnsi="Calibri"/>
                 <w:i w:val="1"/>
                 <w:iCs w:val="1"/>
-                <w:color w:val="548dd4"/>
-                <w:sz w:val="18"/>
-                <w:szCs w:val="18"/>
-              </w:rPr>
-            </w:pPr>
+                <w:sz w:val="18"/>
+                <w:szCs w:val="18"/>
+              </w:rPr>
+            </w:pPr>
+            <w:r>
+              <w:rPr>
+                <w:i w:val="1"/>
+                <w:iCs w:val="1"/>
+                <w:sz w:val="18"/>
+                <w:szCs w:val="18"/>
+                <w:rtl w:val="0"/>
+              </w:rPr>
+              <w:t xml:space="preserve">La definición de este documento facilitara el mantenimiento de la aplicación.</w:t>
+            </w:r>
             <w:r>
               <w:rPr>
                 <w:rtl w:val="0"/>
@@ -14190,20 +14586,22 @@
           <w:tcPr/>
           <w:p>
             <w:pPr>
-              <w:jc w:val="both"/>
-              <w:rPr>
-                <w:rFonts w:ascii="Calibri" w:cs="Calibri" w:eastAsia="Calibri" w:hAnsi="Calibri"/>
-                <w:i w:val="1"/>
-                <w:iCs w:val="1"/>
-                <w:color w:val="548dd4"/>
-                <w:sz w:val="18"/>
-                <w:szCs w:val="18"/>
-              </w:rPr>
-            </w:pPr>
-            <w:r>
-              <w:rPr>
-                <w:rtl w:val="0"/>
-              </w:rPr>
+              <w:rPr>
+                <w:i w:val="1"/>
+                <w:iCs w:val="1"/>
+                <w:sz w:val="18"/>
+                <w:szCs w:val="18"/>
+              </w:rPr>
+            </w:pPr>
+            <w:r>
+              <w:rPr>
+                <w:i w:val="1"/>
+                <w:iCs w:val="1"/>
+                <w:sz w:val="18"/>
+                <w:szCs w:val="18"/>
+                <w:rtl w:val="0"/>
+              </w:rPr>
+              <w:t xml:space="preserve">Documentos y ordenador</w:t>
             </w:r>
           </w:p>
         </w:tc>
@@ -14275,16 +14673,24 @@
           <w:tcPr/>
           <w:p>
             <w:pPr>
-              <w:jc w:val="both"/>
               <w:rPr>
                 <w:rFonts w:ascii="Calibri" w:cs="Calibri" w:eastAsia="Calibri" w:hAnsi="Calibri"/>
                 <w:i w:val="1"/>
                 <w:iCs w:val="1"/>
-                <w:color w:val="548dd4"/>
-                <w:sz w:val="18"/>
-                <w:szCs w:val="18"/>
-              </w:rPr>
-            </w:pPr>
+                <w:sz w:val="18"/>
+                <w:szCs w:val="18"/>
+              </w:rPr>
+            </w:pPr>
+            <w:r>
+              <w:rPr>
+                <w:i w:val="1"/>
+                <w:iCs w:val="1"/>
+                <w:sz w:val="18"/>
+                <w:szCs w:val="18"/>
+                <w:rtl w:val="0"/>
+              </w:rPr>
+              <w:t xml:space="preserve">Permite realizar una retroalimentación, recibiendo lecciones aprendidas, beneficiando a la mejora continua.</w:t>
+            </w:r>
             <w:r>
               <w:rPr>
                 <w:rtl w:val="0"/>
@@ -23205,7 +23611,7 @@
                 <w:szCs w:val="16"/>
                 <w:rtl w:val="0"/>
               </w:rPr>
-              <w:t xml:space="preserve">Creación y unión a rachas compartidas</w:t>
+              <w:t xml:space="preserve">Sistema de puntuación por cumplimiento de actividades</w:t>
             </w:r>
           </w:p>
         </w:tc>
@@ -23576,7 +23982,7 @@
                 <w:szCs w:val="16"/>
                 <w:rtl w:val="0"/>
               </w:rPr>
-              <w:t xml:space="preserve">Compartir rachas con contactos</w:t>
+              <w:t xml:space="preserve">Personalización de perfil</w:t>
             </w:r>
           </w:p>
         </w:tc>

</xml_diff>